<commit_message>
Connect earnings changes and credit evidence across case deliverables
</commit_message>
<xml_diff>
--- a/examples/keshun-2025/deliverables/report.docx
+++ b/examples/keshun-2025/deliverables/report.docx
@@ -40,12 +40,12 @@
     </w:p>
     <w:p>
       <w:r>
-        <w:t>[conditional] 现金季节锚的范围桥尚未闭合；以下数字仅为Δ_A=Δ_H=Γ=0条件参照。以信息截止日的公开证据和明示判断，基准建议主体及科顺转债为BBB+、负面展望。经营C、财务F4的指示单元格为a-/bbb+，选择bbb+；不计可证实的额外支持增益，普通无担保直接债项暂同级。建议以常态融资渠道仍运行、未证实到期不支付，且实际付款日前资金与用途安排足以覆盖为条件。母公司可调度资金和持续承诺后果未核实，不能作为无条件正式评级发布。 [ks_r_recommendation; ks_r_e_business, ks_r_e_finance, ks_r_e_matrix, ks_a_ebitda_2025, ks_d_c_book_ratio, ks_horizon_base_peak_funding_intercept_U650, ks_horizon_collection_delay_5pct_peak_funding_intercept_U650, ks_horizon_e_ar_scope, ks_horizon_e_decontrol_scope]</w:t>
-      </w:r>
-    </w:p>
-    <w:p>
-      <w:r>
-        <w:t>[conditional] 现金季节锚的范围桥尚未闭合；以下数字仅为Δ_A=Δ_H=Γ=0条件参照。从三月末实际集团现金接续的无新增融资模型中，基准季度低点1.44 亿元人民币，恶化低点-3.38 亿元人民币；基准再少收4.88%客户现金即触及季度末零现金。基准另预留用途资金后低点-5.06 亿元人民币。这些是条件值，不能替代六月实际数或月内、母公司支付证明。 [ks_r_liquidity; ks_d_l_e_cash_actual, ks_d_l_e_season, ks_r_base_cash_min, ks_r_worse_cash_min, ks_d_e_fund_new, ks_horizon_e_ar_scope, ks_horizon_e_decontrol_scope]</w:t>
+        <w:t>[conditional] 现金季节锚的范围桥尚未闭合；以下数字仅为Δ_A=Δ_H=Γ=0条件参照。以信息截止日的公开证据和明示判断，基准建议主体及科顺转债为BBB+、负面展望。经营C、财务F4的指示单元格为a-/bbb+，选择bbb+；不计可证实的额外支持增益，普通无担保直接债项暂同级。建议以常态融资渠道仍运行、未证实到期不支付，且实际付款日前资金与用途安排足以覆盖为条件。母公司可调度资金和持续承诺后果未核实，不能作为无条件正式评级发布。 [ks_r_recommendation; ks_r_e_business, ks_r_e_finance, ks_r_e_matrix, ks_a_ebitda_2025, ks_d_c_book_ratio, ks_horizon_base_peak_funding_intercept_U650, ks_horizon_collection_delay_5pct_peak_funding_intercept_U650, ks_horizon_e_ar_scope, ks_horizon_e_decontrol_scope, ks_credit_e_facilities]</w:t>
+      </w:r>
+    </w:p>
+    <w:p>
+      <w:r>
+        <w:t>[conditional] 现金季节锚的范围桥尚未闭合；以下数字仅为Δ_A=Δ_H=Γ=0条件参照。从三月末实际集团现金接续的无新增融资模型中，基准季度低点1.44 亿元人民币，恶化低点-3.38 亿元人民币；基准再少收4.88%客户现金即触及季度末零现金。基准另预留用途资金后低点-5.06 亿元人民币。这些是条件值，不能替代六月实际数或月内、母公司支付证明。 [ks_r_liquidity; ks_d_l_e_cash_actual, ks_d_l_e_season, ks_r_base_cash_min, ks_r_worse_cash_min, ks_d_e_fund_new, ks_horizon_e_ar_scope, ks_horizon_e_decontrol_scope, ks_credit_e_facilities]</w:t>
       </w:r>
     </w:p>
     <w:p>
@@ -265,12 +265,12 @@
     </w:p>
     <w:p>
       <w:r>
-        <w:t>环境3.25 分、自身竞争力3.78 分。年度同定义指标先30/70加权后分档的财务代表值3.74 分落F4；先权会计金额得3.74 分，本案档位相同。固定现有定性判断，量化档内合成范围从3.46 分（含）至4.01 分（不含），跨F5/F4，不能声称BBB+是唯一可推结果。C/F4选较弱端基于最新负EBITDA、母公司负经营现金、第四季回款依赖及用途约束；已进基础因素的弱项不重复扣档。 一年资金容量结果另见ks_horizon_find_horizon：未核还本和用途参数不能填零，融资截距不等于已落实来源。若付款日前所需发行人资源无法落实，建议的资金前提失效，须重新定级。 现金容量还须完成H1/年报版本桥及持续经营范围校正；原数字为Δ_H=Δ_A=0条件分支，不能充作已验证资金覆盖或据此固定评级。</w:t>
-      </w:r>
-    </w:p>
-    <w:p>
-      <w:r>
-        <w:t>证据：ks_r_e_business, ks_r_e_finance, ks_r_e_matrix, ks_a_ebitda_2025, ks_d_c_book_ratio, ks_horizon_base_peak_funding_intercept_U650, ks_horizon_collection_delay_5pct_peak_funding_intercept_U650, ks_horizon_e_ar_scope, ks_horizon_e_decontrol_scope</w:t>
+        <w:t>环境3.25 分、自身竞争力3.78 分。年度同定义指标先30/70加权后分档的财务代表值3.74 分落F4；先权会计金额得3.74 分，本案档位相同。固定现有定性判断，量化档内合成范围从3.46 分（含）至4.01 分（不含），跨F5/F4，不能声称BBB+是唯一可推结果。C/F4选较弱端基于最新负EBITDA、母公司负经营现金、第四季回款依赖及用途约束；已进基础因素的弱项不重复扣档。 一年资金容量结果另见ks_horizon_find_horizon：未核还本和用途参数不能填零，融资截距不等于已落实来源。若付款日前所需发行人资源无法落实，建议的资金前提失效，须重新定级。 现金容量还须完成H1/年报版本桥及持续经营范围校正；原数字为Δ_H=Δ_A=0条件分支，不能充作已验证资金覆盖或据此固定评级。 年报未用银行借款10.8亿元与跟踪报告未用授信47亿元的冲突另见ks_credit_find_facilities，尚未形成银行合同桥；不能以额度披露或现有再融资4.65研究分证明付款资金已落实。</w:t>
+      </w:r>
+    </w:p>
+    <w:p>
+      <w:r>
+        <w:t>证据：ks_r_e_business, ks_r_e_finance, ks_r_e_matrix, ks_a_ebitda_2025, ks_d_c_book_ratio, ks_horizon_base_peak_funding_intercept_U650, ks_horizon_collection_delay_5pct_peak_funding_intercept_U650, ks_horizon_e_ar_scope, ks_horizon_e_decontrol_scope, ks_credit_e_facilities</w:t>
       </w:r>
     </w:p>
     <w:p>
@@ -303,12 +303,12 @@
     </w:p>
     <w:p>
       <w:r>
-        <w:t>经营采购和票据结算在CFO内只扣一次；融资本金和现金利息另扣，未把非现金AP转借款再扣为现金。募集金恢复用途是现金限制敏感性，不是新增外部债本金。负数后续行只显示未融资缺口，晚收款不能抹去先前支付失败。 2027-01-09用途恢复另有静态事件桥；一年展望的季节性延伸见ks_horizon_q_base及回款延期分支。它们单列未知D/X/P/U、营运缓冲及发行人资金条件，不与原用途预留叠扣，也不证明实际连续付款覆盖。</w:t>
-      </w:r>
-    </w:p>
-    <w:p>
-      <w:r>
-        <w:t>证据：ks_d_l_e_cash_actual, ks_d_l_e_season, ks_r_base_cash_min, ks_r_worse_cash_min, ks_d_e_fund_new, ks_horizon_e_ar_scope, ks_horizon_e_decontrol_scope</w:t>
+        <w:t>经营采购和票据结算在CFO内只扣一次；融资本金和现金利息另扣，未把非现金AP转借款再扣为现金。募集金恢复用途是现金限制敏感性，不是新增外部债本金。负数后续行只显示未融资缺口，晚收款不能抹去先前支付失败。 2027-01-09用途恢复另有静态事件桥；一年展望的季节性延伸见ks_horizon_q_base及回款延期分支。它们单列未知D/X/P/U、营运缓冲及发行人资金条件，不与原用途预留叠扣，也不证明实际连续付款覆盖。 年报未用银行借款10.8亿元与跟踪报告未用授信47亿元的冲突另见ks_credit_find_facilities，尚未形成银行合同桥；不能以额度披露或现有再融资4.65研究分证明付款资金已落实。</w:t>
+      </w:r>
+    </w:p>
+    <w:p>
+      <w:r>
+        <w:t>证据：ks_d_l_e_cash_actual, ks_d_l_e_season, ks_r_base_cash_min, ks_r_worse_cash_min, ks_d_e_fund_new, ks_horizon_e_ar_scope, ks_horizon_e_decontrol_scope, ks_credit_e_facilities</w:t>
       </w:r>
     </w:p>
     <w:p>
@@ -692,12 +692,12 @@
     </w:p>
     <w:p>
       <w:r>
-        <w:t>跟踪先更新月度银行现金、实际用途占用、母公司到期表和持续承诺解释，再更新半年度/年度亏损、应收回收、订单及融资。三年完整重述和更可靠预测会改变加权依据；对应结果应重算而非沿用此次分数。没有设置后台监控、没有真实委员会投票。 临时补流按2027-01-09十二个月边界及更早项目需要核查；延伸至2027年6月的条件资金容量须代入实际还本、其他净用途、项目耗用和用途占用，再检验发行人可调度资金及可落实融资。</w:t>
-      </w:r>
-    </w:p>
-    <w:p>
-      <w:r>
-        <w:t>证据：ks_r_e_definitions, ks_r_e_matrix, ks_r_financial_lower, ks_r_financial_upper, ks_d_e_commitment, ks_d_e_fund_new, ks_project_e_schedule</w:t>
+        <w:t>跟踪先更新月度银行现金、实际用途占用、母公司到期表和持续承诺解释，再更新半年度/年度亏损、应收回收、订单及融资。三年完整重述和更可靠预测会改变加权依据；对应结果应重算而非沿用此次分数。没有设置后台监控、没有真实委员会投票。 临时补流按2027-01-09十二个月边界及更早项目需要核查；延伸至2027年6月的条件资金容量须代入实际还本、其他净用途、项目耗用和用途占用，再检验发行人可调度资金及可落实融资。 优先关闭10.8/47亿元额度冲突、年末39户保证至三月及六月的存续滚动，并核保证支持的实际收现和期后追偿。</w:t>
+      </w:r>
+    </w:p>
+    <w:p>
+      <w:r>
+        <w:t>证据：ks_r_e_definitions, ks_r_e_matrix, ks_r_financial_lower, ks_r_financial_upper, ks_d_e_commitment, ks_d_e_fund_new, ks_project_e_schedule, ks_credit_e_facilities, ks_credit_e_dealer_schedule, ks_credit_e_guarantee_q1</w:t>
       </w:r>
     </w:p>
     <w:p>
@@ -1007,32 +1007,32 @@
     </w:p>
     <w:p>
       <w:r>
-        <w:t>净亏损-5.48 亿元人民币，信用与资产损失合计7.87 亿元人民币，会计EBITDA-2.11 亿元人民币。信用损失连续多年存在，不在基础偿债收益中自动全额加回；上期公允价值及补偿收益影响亦需保留。</w:t>
-      </w:r>
-    </w:p>
-    <w:p>
-      <w:r>
-        <w:t>经营利润、非现金重估、债务重组、税务利益与现金各不相同。会计EBITDA加入折旧及利息但保留资产质量成本，不以减值前利润替代可持续现金。</w:t>
-      </w:r>
-    </w:p>
-    <w:p>
-      <w:r>
-        <w:t>证据：ks_a_e_is, ks_a_e_revenue, ks_a_e_debtassets, ks_a_ebitda_2025, ks_a_perf_fv_2024</w:t>
-      </w:r>
-    </w:p>
-    <w:p>
-      <w:r>
-        <w:t>反证：尚无足以排除其他解释的额外证据</w:t>
-      </w:r>
-    </w:p>
-    <w:p>
-      <w:r>
-        <w:t>其他解释：集中确认历史客户损失可使当期亏损高于近期经营现金消耗，但损失对应的现金不可回收并不会因非现金性质消失。；非经常重估或补偿收益可能短期抵销主营亏损，必须观察对应资产变现和后续冲回。</w:t>
-      </w:r>
-    </w:p>
-    <w:p>
-      <w:r>
-        <w:t>判断改变条件：按客户和年度拆分新增信用损失、已计提损失与实际回收，并证明常态业务现金足以覆盖利息及必要投入后，才调整可持续盈利判断。</w:t>
+        <w:t>净亏损-5.48 亿元人民币，信用与资产损失合计7.87 亿元人民币，会计EBITDA-2.11 亿元人民币。归母利润较2024年减少5.71 亿元人民币，其中扣非恶化3.28 亿元人民币、非经常支持减少2.43 亿元人民币，后者占42.51%；不能把恶化全部归于当期一次性损失。</w:t>
+      </w:r>
+    </w:p>
+    <w:p>
+      <w:r>
+        <w:t>公司归母非经常损益从2.97 亿元人民币降至5,444.23 万元人民币，逐项保留税与少数股东影响；扣非归母从-2.62 亿元人民币恶化至-5.90 亿元人民币。金融资产公允价值及处置损益从1.77 亿元人民币降至203.41 万元人民币，单项应收转回从1.37 亿元人民币降至7,987.08 万元人民币。前者不等同公允价值变动科目，后者须核现金回收、抵债或估计变更，非经常分类本身不证明现金收回。两项2024税前收益合计占原会计EBITDA72.51%；仅对称扣除这两项，2024/2025 EBITDA为1.19 亿元人民币/-2.93 亿元人民币，税前利润为-2.68 亿元人民币/-6.74 亿元人民币。这是局部依赖敏感性，并未对政府补助、处置损失、重组和其他项目逐项作经济正常化，也未替换官方评级指标；已列负项不因只挑正收益而被忽略。</w:t>
+      </w:r>
+    </w:p>
+    <w:p>
+      <w:r>
+        <w:t>证据：ks_a_e_is, ks_a_e_revenue, ks_a_e_debtassets, ks_a_ebitda_2025, ks_a_perf_fv_2024, ks_earn_e_nonrec, ks_earn_nonrec_contribution, ks_earn_two_gains_share_2024, ks_earn_ebitda_sensitivity_2024, ks_earn_ebitda_sensitivity_2025</w:t>
+      </w:r>
+    </w:p>
+    <w:p>
+      <w:r>
+        <w:t>反证：ks_earn_reversal_2025, ks_earn_disposal_2025, ks_earn_restructuring_2025</w:t>
+      </w:r>
+    </w:p>
+    <w:p>
+      <w:r>
+        <w:t>其他解释：集中确认历史客户损失会使当期亏损高于现金支出，但持续发生的信用成本不能自动全额加回。；应收转回可能来自真实收款，也可能来自抵债及估计变化；须逐笔对应现金、资产接收和准备滚动后判断。；资产处置及债务重组损失也应按经济性质对称审查；公司扣非口径、分析者正常化和机构偿债收益定义分别保留。</w:t>
+      </w:r>
+    </w:p>
+    <w:p>
+      <w:r>
+        <w:t>判断改变条件：按客户和年度拆分新增损失、实际回收及转回依据；把金融资产损益对应到处置现金与剩余估值敞口，对持续补助和负向非经常项目作同等核查。证明常态经营收益和现金覆盖利息及必要投入后再改善盈利判断；仅观察2024正EBITDA或2025转回收益不足以成立。</w:t>
       </w:r>
     </w:p>
     <w:p>
@@ -2489,6 +2489,228 @@
           </w:p>
         </w:tc>
       </w:tr>
+      <w:tr>
+        <w:trPr>
+          <w:cantSplit/>
+        </w:trPr>
+        <w:tc>
+          <w:tcPr>
+            <w:tcW w:type="dxa" w:w="3411"/>
+          </w:tcPr>
+          <w:p>
+            <w:r>
+              <w:t>年报未使用银行借款额度 [ks_a_undrawn]</w:t>
+            </w:r>
+          </w:p>
+        </w:tc>
+        <w:tc>
+          <w:tcPr>
+            <w:tcW w:type="dxa" w:w="4386"/>
+          </w:tcPr>
+          <w:p>
+            <w:r>
+              <w:t>2025-12-31</w:t>
+              <w:br/>
+              <w:t>10.80 亿元人民币</w:t>
+            </w:r>
+          </w:p>
+        </w:tc>
+        <w:tc>
+          <w:tcPr>
+            <w:tcW w:type="dxa" w:w="1949"/>
+          </w:tcPr>
+          <w:p>
+            <w:r>
+              <w:t>ks_a_e_maturity</w:t>
+            </w:r>
+          </w:p>
+        </w:tc>
+      </w:tr>
+      <w:tr>
+        <w:trPr>
+          <w:cantSplit/>
+        </w:trPr>
+        <w:tc>
+          <w:tcPr>
+            <w:tcW w:type="dxa" w:w="3411"/>
+          </w:tcPr>
+          <w:p>
+            <w:r>
+              <w:t>跟踪报告未使用银行授信 [ks_credit_facility_undrawn]</w:t>
+            </w:r>
+          </w:p>
+        </w:tc>
+        <w:tc>
+          <w:tcPr>
+            <w:tcW w:type="dxa" w:w="4386"/>
+          </w:tcPr>
+          <w:p>
+            <w:r>
+              <w:t>2025-12-31</w:t>
+              <w:br/>
+              <w:t>47.00 亿元人民币</w:t>
+            </w:r>
+          </w:p>
+        </w:tc>
+        <w:tc>
+          <w:tcPr>
+            <w:tcW w:type="dxa" w:w="1949"/>
+          </w:tcPr>
+          <w:p>
+            <w:r>
+              <w:t>ks_credit_e_facilities</w:t>
+            </w:r>
+          </w:p>
+        </w:tc>
+      </w:tr>
+      <w:tr>
+        <w:trPr>
+          <w:cantSplit/>
+        </w:trPr>
+        <w:tc>
+          <w:tcPr>
+            <w:tcW w:type="dxa" w:w="3411"/>
+          </w:tcPr>
+          <w:p>
+            <w:r>
+              <w:t>两来源未用额度名义差额（口径未调齐） [ks_credit_facility_gap]</w:t>
+            </w:r>
+          </w:p>
+        </w:tc>
+        <w:tc>
+          <w:tcPr>
+            <w:tcW w:type="dxa" w:w="4386"/>
+          </w:tcPr>
+          <w:p>
+            <w:r>
+              <w:t>2025-12-31</w:t>
+              <w:br/>
+              <w:t>36.20 亿元人民币</w:t>
+            </w:r>
+          </w:p>
+        </w:tc>
+        <w:tc>
+          <w:tcPr>
+            <w:tcW w:type="dxa" w:w="1949"/>
+          </w:tcPr>
+          <w:p>
+            <w:r>
+              <w:t>ks_a_e_maturity, ks_credit_e_facilities</w:t>
+            </w:r>
+          </w:p>
+        </w:tc>
+      </w:tr>
+      <w:tr>
+        <w:trPr>
+          <w:cantSplit/>
+        </w:trPr>
+        <w:tc>
+          <w:tcPr>
+            <w:tcW w:type="dxa" w:w="3411"/>
+          </w:tcPr>
+          <w:p>
+            <w:r>
+              <w:t>年末前十笔经销担保合计 [ks_credit_dealer_top10]</w:t>
+            </w:r>
+          </w:p>
+        </w:tc>
+        <w:tc>
+          <w:tcPr>
+            <w:tcW w:type="dxa" w:w="4386"/>
+          </w:tcPr>
+          <w:p>
+            <w:r>
+              <w:t>2025-12-31</w:t>
+              <w:br/>
+              <w:t>1.23 亿元人民币</w:t>
+            </w:r>
+          </w:p>
+        </w:tc>
+        <w:tc>
+          <w:tcPr>
+            <w:tcW w:type="dxa" w:w="1949"/>
+          </w:tcPr>
+          <w:p>
+            <w:r>
+              <w:t>ks_credit_e_dealer_schedule</w:t>
+            </w:r>
+          </w:p>
+        </w:tc>
+      </w:tr>
+      <w:tr>
+        <w:trPr>
+          <w:cantSplit/>
+        </w:trPr>
+        <w:tc>
+          <w:tcPr>
+            <w:tcW w:type="dxa" w:w="3411"/>
+          </w:tcPr>
+          <w:p>
+            <w:r>
+              <w:t>原表七笔六月担保到期金额 [ks_credit_dealer_june]</w:t>
+            </w:r>
+          </w:p>
+        </w:tc>
+        <w:tc>
+          <w:tcPr>
+            <w:tcW w:type="dxa" w:w="4386"/>
+          </w:tcPr>
+          <w:p>
+            <w:r>
+              <w:t>2025-12-31</w:t>
+              <w:br/>
+              <w:t>1.04 亿元人民币</w:t>
+            </w:r>
+          </w:p>
+        </w:tc>
+        <w:tc>
+          <w:tcPr>
+            <w:tcW w:type="dxa" w:w="1949"/>
+          </w:tcPr>
+          <w:p>
+            <w:r>
+              <w:t>ks_credit_e_dealer_schedule</w:t>
+            </w:r>
+          </w:p>
+        </w:tc>
+      </w:tr>
+      <w:tr>
+        <w:trPr>
+          <w:cantSplit/>
+        </w:trPr>
+        <w:tc>
+          <w:tcPr>
+            <w:tcW w:type="dxa" w:w="3411"/>
+          </w:tcPr>
+          <w:p>
+            <w:r>
+              <w:t>三月末集团外经销商实际担保 [ks_credit_guarantee_external_q1]</w:t>
+            </w:r>
+          </w:p>
+        </w:tc>
+        <w:tc>
+          <w:tcPr>
+            <w:tcW w:type="dxa" w:w="4386"/>
+          </w:tcPr>
+          <w:p>
+            <w:r>
+              <w:t>2026-03-31</w:t>
+              <w:br/>
+              <w:t>7,655.11 万元人民币</w:t>
+            </w:r>
+          </w:p>
+        </w:tc>
+        <w:tc>
+          <w:tcPr>
+            <w:tcW w:type="dxa" w:w="1949"/>
+          </w:tcPr>
+          <w:p>
+            <w:r>
+              <w:t>ks_credit_e_guarantee_q1</w:t>
+            </w:r>
+          </w:p>
+        </w:tc>
+      </w:tr>
     </w:tbl>
     <w:p/>
     <w:p>
@@ -2534,37 +2756,37 @@
         <w:pStyle w:val="Heading2"/>
       </w:pPr>
       <w:r>
-        <w:t>现金质量、季节性及分红 [ks_a_find_cfo; supported]</w:t>
-      </w:r>
-    </w:p>
-    <w:p>
-      <w:r>
-        <w:t>全年CFO3.20 亿元人民币，扣现金资本开支后1.47 亿元人民币，再扣已分红后-2.41 亿元人民币。末季贡献11.44 亿元人民币，期间现金波动明显。</w:t>
-      </w:r>
-    </w:p>
-    <w:p>
-      <w:r>
-        <w:t>间接桥中大额非现金减值并不产生现金；经营性应付项目合计形成正向调节，但其贡献同比减少。尚未取得组成、结算、非现金及范围变动的分解，不能将该合计或保证金收付直接归因为供应商融资或客户押金提供现金。全年正值仍须结合前三季流出和融资依赖判断。</w:t>
-      </w:r>
-    </w:p>
-    <w:p>
-      <w:r>
-        <w:t>证据：ks_a_e_cf, ks_a_e_indirect, ks_a_e_summary, ks_a_e_equity, ks_a_indirect_cfo_2025</w:t>
-      </w:r>
-    </w:p>
-    <w:p>
-      <w:r>
-        <w:t>反证：尚无足以排除其他解释的额外证据</w:t>
-      </w:r>
-    </w:p>
-    <w:p>
-      <w:r>
-        <w:t>其他解释：利润至经营现金的改善可能由非现金信用损失加回形成，不能把加回项目视为经营盈利恢复。；应收净额下降也可能由核销和抵债形成；年末集中收款与下一季现金流出并存时，全年正经营现金不能证明期内无缺口。</w:t>
-      </w:r>
-    </w:p>
-    <w:p>
-      <w:r>
-        <w:t>判断改变条件：取得按客户的季度及月度银行收现、非现金重组和供应商付款桥，并证明现金覆盖利息、必要资本投入和分红后仍有余量，才提高现金生成质量判断。</w:t>
+        <w:t>未用借款与授信披露冲突，融资落实条件待核 [ks_credit_find_facilities; unresolved]</w:t>
+      </w:r>
+    </w:p>
+    <w:p>
+      <w:r>
+        <w:t>年报未用银行借款额度10.80 亿元人民币，跟踪报告同称2025年底的银行授信总额73.00 亿元人民币、未用47.00 亿元人民币。未用披露名义差额36.20 亿元人民币，尚未解释。两来源用词不同只是待核线索，不能据此称口径已对齐，任何一项也未作为已落实现金计入。</w:t>
+      </w:r>
+    </w:p>
+    <w:p>
+      <w:r>
+        <w:t>按同一法人、银行及产品对应总额、已用、未用、共享或循环额度，核抵质押、保证金、财务约束、提款前提、撤销权和有效期，再将真正可用金额匹配付款日。综合授信可能包含票据、保函或其他产品，年报借款额度也可能有不同总体；这些是候选解释，不是已查明原因。现有再融资研究分5.0/4.5及加权4.65仅保留为原条件分支，金额冲突未关闭前不能证明这一赋值或BBB+资金前提充分，也不因缺资料任意另给分。</w:t>
+      </w:r>
+    </w:p>
+    <w:p>
+      <w:r>
+        <w:t>证据：ks_a_e_maturity, ks_credit_e_facilities, ks_credit_facility_gap</w:t>
+      </w:r>
+    </w:p>
+    <w:p>
+      <w:r>
+        <w:t>反证：ks_a_e_q1</w:t>
+      </w:r>
+    </w:p>
+    <w:p>
+      <w:r>
+        <w:t>其他解释：一季度实际新增借款证明当季有融资发生，但不能证明六月以后的未用额度、提款条件或母公司付款能力。；若合同总体差异完整解释差额且足额资源可按时提用，可支持融资能力；若主要是可撤销、受限或非现金产品，则应降低可依赖融资并重新评估因素和资金前提。</w:t>
+      </w:r>
+    </w:p>
+    <w:p>
+      <w:r>
+        <w:t>判断改变条件：取得两个披露总体的逐项桥及银行直接证据，列明每个付款日已承诺可提金额、条件满足状态和现金所在法人；仍未解释部分排除已落实来源。以核实结果更新再融资因素及资金情景；先检查付款前提是否失效，再决定等级和展望，不沿用4.65作为已证实结论。</w:t>
       </w:r>
     </w:p>
     <w:p>
@@ -2572,37 +2794,37 @@
         <w:pStyle w:val="Heading2"/>
       </w:pPr>
       <w:r>
-        <w:t>债务定义、期限和利息 [ks_a_find_debt; supported]</w:t>
-      </w:r>
-    </w:p>
-    <w:p>
-      <w:r>
-        <w:t>含票据及其他借款的广义债务52.73 亿元人民币，债务资本化率56.55%，现金/短期债0.57 倍。转债摊余成本、租赁及非现金融资需纳入；预计质量负债从利息债中剔开。</w:t>
-      </w:r>
-    </w:p>
-    <w:p>
-      <w:r>
-        <w:t>利润与权益缩水会抵消债务名义下降。利息含资本化2,735.06 万元人民币，现金还本额不等同借款账面变动。未折现合同期限表含经营负债，不能直接当作有息债。</w:t>
-      </w:r>
-    </w:p>
-    <w:p>
-      <w:r>
-        <w:t>证据：ks_a_e_liabs, ks_a_e_debtorroll, ks_a_e_maturity, ks_a_bondroll, ks_a_debtorrollcalc</w:t>
-      </w:r>
-    </w:p>
-    <w:p>
-      <w:r>
-        <w:t>反证：尚无足以排除其他解释的额外证据</w:t>
-      </w:r>
-    </w:p>
-    <w:p>
-      <w:r>
-        <w:t>其他解释：借款或应付票据减少可能来自现金清偿，也可能来自重分类、票据结算或并表范围变化。；未终止确认背书票据仍有追索风险；是否属于融资债务要与对应其他流动负债核对，不能重复加已计入项目。</w:t>
-      </w:r>
-    </w:p>
-    <w:p>
-      <w:r>
-        <w:t>判断改变条件：拿到账面至合同本金的逐笔调节、债权人和到期日，并确认背书追索及供应商融资性质后重算债务、短债覆盖和融资缺口。</w:t>
+        <w:t>现金质量、季节性及分红 [ks_a_find_cfo; supported]</w:t>
+      </w:r>
+    </w:p>
+    <w:p>
+      <w:r>
+        <w:t>全年CFO3.20 亿元人民币，扣现金资本开支后1.47 亿元人民币，再扣已分红后-2.41 亿元人民币。末季贡献11.44 亿元人民币，期间现金波动明显。</w:t>
+      </w:r>
+    </w:p>
+    <w:p>
+      <w:r>
+        <w:t>间接桥中大额非现金减值并不产生现金；经营性应付项目合计形成正向调节，但其贡献同比减少。尚未取得组成、结算、非现金及范围变动的分解，不能将该合计或保证金收付直接归因为供应商融资或客户押金提供现金。全年正值仍须结合前三季流出和融资依赖判断。 经销商被担保贷款按公开安排用于付公司货款，跟踪报告称主要用于年底前结清应付；需核真实保证支持收现流量及可持续性。年末担保余额不是年度收现流量，不能直接扣减CFO。</w:t>
+      </w:r>
+    </w:p>
+    <w:p>
+      <w:r>
+        <w:t>证据：ks_a_e_cf, ks_a_e_indirect, ks_a_e_summary, ks_a_e_equity, ks_a_indirect_cfo_2025, ks_credit_e_dealer_use, ks_credit_e_yearend_settlement</w:t>
+      </w:r>
+    </w:p>
+    <w:p>
+      <w:r>
+        <w:t>反证：ks_credit_e_guarantee_q1</w:t>
+      </w:r>
+    </w:p>
+    <w:p>
+      <w:r>
+        <w:t>其他解释：利润至经营现金的改善可能由非现金信用损失加回形成，不能把加回项目视为经营盈利恢复。；应收净额下降也可能由核销和抵债形成；年末集中收款与下一季现金流出并存时，全年正经营现金不能证明期内无缺口。</w:t>
+      </w:r>
+    </w:p>
+    <w:p>
+      <w:r>
+        <w:t>判断改变条件：取得按客户的季度及月度银行收现、非现金重组和供应商付款桥，并证明现金覆盖利息、必要资本投入和分红后仍有余量，才提高现金生成质量判断。 将经销银行放款与本公司收款逐笔匹配，并与保证余额滚动/逾期情况联查，才能辨别可持续经营回款和依赖保证续作的收现。</w:t>
       </w:r>
     </w:p>
     <w:p>
@@ -2610,22 +2832,22 @@
         <w:pStyle w:val="Heading2"/>
       </w:pPr>
       <w:r>
-        <w:t>供应商融资与现金分类 [ks_a_find_supplier; conditional]</w:t>
-      </w:r>
-    </w:p>
-    <w:p>
-      <w:r>
-        <w:t>安排总额4.60 亿元人民币，已入短借2.83 亿元人民币，余AP1.77 亿元人民币。若AP部分全部视为融资，债务为54.51 亿元人民币，资本化比率57.36%；属于有条件敏感性。</w:t>
-      </w:r>
-    </w:p>
-    <w:p>
-      <w:r>
-        <w:t>付款期延长、平台支付和AP转借款改变融资依赖；已入借款部分不能再加一次，非现金转项不能计作CFO收现。</w:t>
-      </w:r>
-    </w:p>
-    <w:p>
-      <w:r>
-        <w:t>证据：ks_a_e_supplier, ks_a_e_debtorroll, ks_a_supplier_sum_2025</w:t>
+        <w:t>债务定义、期限和利息 [ks_a_find_debt; supported]</w:t>
+      </w:r>
+    </w:p>
+    <w:p>
+      <w:r>
+        <w:t>含票据及其他借款的广义债务52.73 亿元人民币，债务资本化率56.55%，现金/短期债0.57 倍。转债摊余成本、租赁及非现金融资需纳入；预计质量负债从利息债中剔开。</w:t>
+      </w:r>
+    </w:p>
+    <w:p>
+      <w:r>
+        <w:t>利润与权益缩水会抵消债务名义下降。利息含资本化2,735.06 万元人民币，现金还本额不等同借款账面变动。未折现合同期限表含经营负债，不能直接当作有息债。</w:t>
+      </w:r>
+    </w:p>
+    <w:p>
+      <w:r>
+        <w:t>证据：ks_a_e_liabs, ks_a_e_debtorroll, ks_a_e_maturity, ks_a_bondroll, ks_a_debtorrollcalc</w:t>
       </w:r>
     </w:p>
     <w:p>
@@ -2635,12 +2857,12 @@
     </w:p>
     <w:p>
       <w:r>
-        <w:t>其他解释：AP部分可能仍是正常采购信用，也可能因融资方介入和账期延长而具有借款实质。；短借已包含平台融资，不能因供应商已收款再加同一债务。</w:t>
-      </w:r>
-    </w:p>
-    <w:p>
-      <w:r>
-        <w:t>判断改变条件：取得融资协议、付款展期和追索安排后确定AP部分重分类；核对银行流水后再调整现金流。</w:t>
+        <w:t>其他解释：借款或应付票据减少可能来自现金清偿，也可能来自重分类、票据结算或并表范围变化。；未终止确认背书票据仍有追索风险；是否属于融资债务要与对应其他流动负债核对，不能重复加已计入项目。</w:t>
+      </w:r>
+    </w:p>
+    <w:p>
+      <w:r>
+        <w:t>判断改变条件：拿到账面至合同本金的逐笔调节、债权人和到期日，并确认背书追索及供应商融资性质后重算债务、短债覆盖和融资缺口。</w:t>
       </w:r>
     </w:p>
     <w:p>
@@ -2648,22 +2870,22 @@
         <w:pStyle w:val="Heading2"/>
       </w:pPr>
       <w:r>
-        <w:t>母公司偿债资源与集团往来 [ks_a_find_parent; conditional]</w:t>
-      </w:r>
-    </w:p>
-    <w:p>
-      <w:r>
-        <w:t>母公司盈利1.41 亿元人民币但CFO-7.32 亿元人民币；投资收益4.51 亿元人民币及巨额集团往来影响现金。母公司权益表期初另追溯78.57 万元人民币已单列桥接。</w:t>
-      </w:r>
-    </w:p>
-    <w:p>
-      <w:r>
-        <w:t>子公司分红能力、资金归集、限制性条款与集团内部往来可回收性决定现金上划；合并报表抵销无法证明母公司可自由调动全部现金。</w:t>
-      </w:r>
-    </w:p>
-    <w:p>
-      <w:r>
-        <w:t>证据：ks_a_e_parent, ks_a_e_invest, ks_a_p_equityroll</w:t>
+        <w:t>供应商融资与现金分类 [ks_a_find_supplier; conditional]</w:t>
+      </w:r>
+    </w:p>
+    <w:p>
+      <w:r>
+        <w:t>安排总额4.60 亿元人民币，已入短借2.83 亿元人民币，余AP1.77 亿元人民币。若AP部分全部视为融资，债务为54.51 亿元人民币，资本化比率57.36%；属于有条件敏感性。</w:t>
+      </w:r>
+    </w:p>
+    <w:p>
+      <w:r>
+        <w:t>付款期延长、平台支付和AP转借款改变融资依赖；已入借款部分不能再加一次，非现金转项不能计作CFO收现。</w:t>
+      </w:r>
+    </w:p>
+    <w:p>
+      <w:r>
+        <w:t>证据：ks_a_e_supplier, ks_a_e_debtorroll, ks_a_supplier_sum_2025</w:t>
       </w:r>
     </w:p>
     <w:p>
@@ -2673,12 +2895,12 @@
     </w:p>
     <w:p>
       <w:r>
-        <w:t>其他解释：母公司负CFO可能因内部往来结算时点，不必然反映合并外部经营恶化。；子公司分红可支持母公司，但若受股权、契约或流动性约束，账面投资收益不足以覆盖偿债。</w:t>
-      </w:r>
-    </w:p>
-    <w:p>
-      <w:r>
-        <w:t>判断改变条件：取得母公司债务到期表、子公司上划决议与现金到账、资金归集合同及往来可回收证据后判断发行主体资源。</w:t>
+        <w:t>其他解释：AP部分可能仍是正常采购信用，也可能因融资方介入和账期延长而具有借款实质。；短借已包含平台融资，不能因供应商已收款再加同一债务。</w:t>
+      </w:r>
+    </w:p>
+    <w:p>
+      <w:r>
+        <w:t>判断改变条件：取得融资协议、付款展期和追索安排后确定AP部分重分类；核对银行流水后再调整现金流。</w:t>
       </w:r>
     </w:p>
     <w:p>
@@ -2686,22 +2908,22 @@
         <w:pStyle w:val="Heading2"/>
       </w:pPr>
       <w:r>
-        <w:t>收购、出表、少数权益与基金承诺 [ks_a_find_scope_deals; conditional]</w:t>
-      </w:r>
-    </w:p>
-    <w:p>
-      <w:r>
-        <w:t>同控收购支付8,200.00 万元人民币，顺控保理出表带出净现金1.15 亿元人民币；少数权益收购、金融资产重估和基金承诺分别处理。</w:t>
-      </w:r>
-    </w:p>
-    <w:p>
-      <w:r>
-        <w:t>同控并非经营收益，出表现金减少不同于资本开支，剩余权益估值与可支配资金不同；基金未实缴承诺可能形成未来资金需求。</w:t>
-      </w:r>
-    </w:p>
-    <w:p>
-      <w:r>
-        <w:t>证据：ks_a_e_invest, ks_a_e_related, ks_a_e_equity</w:t>
+        <w:t>母公司偿债资源与集团往来 [ks_a_find_parent; conditional]</w:t>
+      </w:r>
+    </w:p>
+    <w:p>
+      <w:r>
+        <w:t>母公司盈利1.41 亿元人民币但CFO-7.32 亿元人民币；投资收益4.51 亿元人民币及巨额集团往来影响现金。母公司权益表期初另追溯78.57 万元人民币已单列桥接。</w:t>
+      </w:r>
+    </w:p>
+    <w:p>
+      <w:r>
+        <w:t>子公司分红能力、资金归集、限制性条款与集团内部往来可回收性决定现金上划；合并报表抵销无法证明母公司可自由调动全部现金。</w:t>
+      </w:r>
+    </w:p>
+    <w:p>
+      <w:r>
+        <w:t>证据：ks_a_e_parent, ks_a_e_invest, ks_a_p_equityroll</w:t>
       </w:r>
     </w:p>
     <w:p>
@@ -2711,12 +2933,12 @@
     </w:p>
     <w:p>
       <w:r>
-        <w:t>其他解释：处置子公司带出现金与取得处置价款属于不同现金方向，不能仅看净投资现金推断投资回报。；同控收购对价、公允价值重估及少数股东交易不都进入损益；权益变动不能用现金分红或融资现金倒挤。</w:t>
-      </w:r>
-    </w:p>
-    <w:p>
-      <w:r>
-        <w:t>判断改变条件：取得交割协议、付款/收款、剩余股权估值和基金实际实缴及资本调用计划后，更新权益、未来支出和集团现金分配。</w:t>
+        <w:t>其他解释：母公司负CFO可能因内部往来结算时点，不必然反映合并外部经营恶化。；子公司分红可支持母公司，但若受股权、契约或流动性约束，账面投资收益不足以覆盖偿债。</w:t>
+      </w:r>
+    </w:p>
+    <w:p>
+      <w:r>
+        <w:t>判断改变条件：取得母公司债务到期表、子公司上划决议与现金到账、资金归集合同及往来可回收证据后判断发行主体资源。</w:t>
       </w:r>
     </w:p>
     <w:p>
@@ -2724,37 +2946,75 @@
         <w:pStyle w:val="Heading2"/>
       </w:pPr>
       <w:r>
+        <w:t>收购、出表、少数权益与基金承诺 [ks_a_find_scope_deals; conditional]</w:t>
+      </w:r>
+    </w:p>
+    <w:p>
+      <w:r>
+        <w:t>同控收购支付8,200.00 万元人民币，顺控保理出表带出净现金1.15 亿元人民币；少数权益收购、金融资产重估和基金承诺分别处理。</w:t>
+      </w:r>
+    </w:p>
+    <w:p>
+      <w:r>
+        <w:t>同控并非经营收益，出表现金减少不同于资本开支，剩余权益估值与可支配资金不同；基金未实缴承诺可能形成未来资金需求。</w:t>
+      </w:r>
+    </w:p>
+    <w:p>
+      <w:r>
+        <w:t>证据：ks_a_e_invest, ks_a_e_related, ks_a_e_equity</w:t>
+      </w:r>
+    </w:p>
+    <w:p>
+      <w:r>
+        <w:t>反证：尚无足以排除其他解释的额外证据</w:t>
+      </w:r>
+    </w:p>
+    <w:p>
+      <w:r>
+        <w:t>其他解释：处置子公司带出现金与取得处置价款属于不同现金方向，不能仅看净投资现金推断投资回报。；同控收购对价、公允价值重估及少数股东交易不都进入损益；权益变动不能用现金分红或融资现金倒挤。</w:t>
+      </w:r>
+    </w:p>
+    <w:p>
+      <w:r>
+        <w:t>判断改变条件：取得交割协议、付款/收款、剩余股权估值和基金实际实缴及资本调用计划后，更新权益、未来支出和集团现金分配。</w:t>
+      </w:r>
+    </w:p>
+    <w:p>
+      <w:pPr>
+        <w:pStyle w:val="Heading2"/>
+      </w:pPr>
+      <w:r>
         <w:t>保证、诉讼、质量与关联支持 [ks_a_find_contingent; conditional]</w:t>
       </w:r>
     </w:p>
     <w:p>
       <w:r>
-        <w:t>外部经销商保证余额1.60 亿元人民币、保函1.66 亿元人民币及产品质量预计负债需逐项追踪。集团内部保证不得与已并表基础债务重复加总。</w:t>
-      </w:r>
-    </w:p>
-    <w:p>
-      <w:r>
-        <w:t>诉讼/质保支出和经销商代偿可能与客户弱化同时出现；控制人保证、持股及银行未用授信不等于无条件现金支持。</w:t>
-      </w:r>
-    </w:p>
-    <w:p>
-      <w:r>
-        <w:t>证据：ks_a_e_related, ks_a_e_liabs, ks_a_e_governance, ks_a_e_maturity</w:t>
-      </w:r>
-    </w:p>
-    <w:p>
-      <w:r>
-        <w:t>反证：尚无足以排除其他解释的额外证据</w:t>
-      </w:r>
-    </w:p>
-    <w:p>
-      <w:r>
-        <w:t>其他解释：经销商保证有反担保并不消除共同下行时的代偿压力；反担保资产可实现价值须单独核验。；集团内保证对应已并表债务时主要改变追索和现金所在法人，并非额外一份合并本金。</w:t>
-      </w:r>
-    </w:p>
-    <w:p>
-      <w:r>
-        <w:t>判断改变条件：取得债权人、被担保人、已提款余额、追索顺位、反担保资产及触发事件后，按同一经济义务去重并重算或有现金和回收。</w:t>
+        <w:t>年末集团外经销担保1.60 亿元人民币；前十笔1.23 亿元人民币、占77.08%，其中原表七笔六月担保到期金额1.04 亿元人民币。三月末公告实际集团外余额降至7,655.11 万元人民币，降幅52.18%；集团内1.21 亿元人民币另列。余额下降是反证，不证明前十笔已逐笔解除或截至六月仍无风险。</w:t>
+      </w:r>
+    </w:p>
+    <w:p>
+      <w:r>
+        <w:t>原表“担保到期日”不是公司代偿日；39户需从年末经新增、续期、偿还、解除和代偿分别桥至三月末及六月。经销贷款按披露用于付公司货款，年底结清应付可能改善收现却留下保证责任：同一客户压力可同时削弱销售/收款并触发代偿。不得将年末存量直接从CFO扣除。2026-016新增审批3.60 亿元人民币但协议未签，不是已发生义务或确定融资。已开保函1.66 亿元人民币、诉讼及质保义务仍单列；集团内保证与并表基础债务去重。</w:t>
+      </w:r>
+    </w:p>
+    <w:p>
+      <w:r>
+        <w:t>证据：ks_credit_e_dealer_schedule, ks_credit_e_guarantee_q1, ks_credit_e_guarantee_approval, ks_credit_e_dealer_use, ks_credit_e_yearend_settlement, ks_a_e_liabs, ks_a_e_related</w:t>
+      </w:r>
+    </w:p>
+    <w:p>
+      <w:r>
+        <w:t>反证：ks_credit_e_guarantee_q1</w:t>
+      </w:r>
+    </w:p>
+    <w:p>
+      <w:r>
+        <w:t>其他解释：三月末实际余额下降且公司声明无逾期、涉诉及败诉代偿，有利于风险判断；它未说明逐户变化原因或六月状态。；反担保可能有回收价值，但需核权属、顺位、可执行性及时间；先列发行人毛付款，再列有依据的追偿，不能抵销当天现金。</w:t>
+      </w:r>
+    </w:p>
+    <w:p>
+      <w:r>
+        <w:t>判断改变条件：全查原表前十笔及新增、展期、逾期、追偿和代偿事项；取得其余29户完整台账并核全量滚动，不能外推。把贷款放款—客户付款—发票/应收结算和实际保证状态逐户连接，区分新销售、旧款回收、预收与借新还旧；将净增或有损失与实际现金时点分别进入资产/现金质量、融资及个体调整，消除与回款和已并表债务重复计算。</w:t>
       </w:r>
     </w:p>
     <w:p>
@@ -3459,7 +3719,7 @@
     </w:p>
     <w:p>
       <w:r>
-        <w:t>现金分红3.88 亿元人民币，为经营净现金3.20 亿元人民币的121.54%；基金认缴2.40 亿元人民币、拟存续8.00 年，经销商等对外担保余额1.60 亿元人民币。认缴不等于当年已付现金，反担保不消除保证责任。</w:t>
+        <w:t>现金分红3.88 亿元人民币，为经营净现金3.20 亿元人民币的121.54%；基金认缴2.40 亿元人民币、拟存续8.00 年，经销商等对外担保余额1.60 亿元人民币。认缴不等于当年已付现金，反担保不消除保证责任。 上述经销担保为年末数；三月末集团外实际余额降至7,655.11 万元人民币，不沿用年末存量代表六月。</w:t>
       </w:r>
     </w:p>
     <w:p>
@@ -3469,7 +3729,7 @@
     </w:p>
     <w:p>
       <w:r>
-        <w:t>反证：ks_b_e_2026_dividend, ks_b_e_fund_return</w:t>
+        <w:t>反证：ks_b_e_2026_dividend, ks_b_e_fund_return, ks_credit_e_guarantee_q1</w:t>
       </w:r>
     </w:p>
     <w:p>
@@ -6630,6 +6890,41 @@
     </w:p>
     <w:p>
       <w:r>
+        <w:t>2024年归母非经常损益原表重算 [ks_earn_r_net_2024]：within_input_tolerance；基础单位残差 0.00。 按元、分原值精确运算；加总闭合不证明分类或空白项目均已取得交易证据。</w:t>
+      </w:r>
+    </w:p>
+    <w:p>
+      <w:r>
+        <w:t>2024年归母净利与公司扣非调节 [ks_earn_r_deducted_2024]：within_input_tolerance；基础单位残差 0.00。 按元、分原值精确运算；加总闭合不证明分类或空白项目均已取得交易证据。</w:t>
+      </w:r>
+    </w:p>
+    <w:p>
+      <w:r>
+        <w:t>2025年归母非经常损益原表重算 [ks_earn_r_net_2025]：within_input_tolerance；基础单位残差 0.00。 按元、分原值精确运算；加总闭合不证明分类或空白项目均已取得交易证据。</w:t>
+      </w:r>
+    </w:p>
+    <w:p>
+      <w:r>
+        <w:t>2025年归母净利与公司扣非调节 [ks_earn_r_deducted_2025]：within_input_tolerance；基础单位残差 0.00。 按元、分原值精确运算；加总闭合不证明分类或空白项目均已取得交易证据。</w:t>
+      </w:r>
+    </w:p>
+    <w:p>
+      <w:r>
+        <w:t>归母利润变化两部分桥 [ks_earn_r_decline]：within_input_tolerance；基础单位残差 0.00。 同范围两期差额精确分解，不解释为现金或因果贡献。</w:t>
+      </w:r>
+    </w:p>
+    <w:p>
+      <w:r>
+        <w:t>年末经销担保逐项加总 [ks_credit_r_dealer_total]：within_input_tolerance；基础单位残差 0.00。 原表元金额，加总前十名及其他29家；不是逐笔合同核验</w:t>
+      </w:r>
+    </w:p>
+    <w:p>
+      <w:r>
+        <w:t>三月末内外实际担保勾稽 [ks_credit_r_guarantee_q1]：within_input_tolerance；基础单位残差 0.00。 同一公告的万元金额按原单位转元加总；不证明到期或解除</w:t>
+      </w:r>
+    </w:p>
+    <w:p>
+      <w:r>
         <w:br w:type="page"/>
       </w:r>
     </w:p>
@@ -8278,7 +8573,7 @@
     </w:p>
     <w:p>
       <w:r>
-        <w:t>证据记录：ks_r_e_finance, ks_r_e_history, ks_a_e_is, ks_a_e_cash, ks_a_e_ar</w:t>
+        <w:t>证据记录：ks_r_e_finance, ks_r_e_history, ks_a_e_is, ks_a_e_cash, ks_a_e_ar, ks_credit_e_facilities</w:t>
       </w:r>
     </w:p>
     <w:p>
@@ -8347,6 +8642,11 @@
     <w:p>
       <w:r>
         <w:t>数据先加权再赋分更贴近PDF26文字；公开原文未唯一指定对年度比率先加权还是对会计金额先加权再求比率。本案两路并列。档内中点是研究代表值，不是官方插值函数；年度分数先加权不再作为决定依据。</w:t>
+      </w:r>
+    </w:p>
+    <w:p>
+      <w:r>
+        <w:t>年报未用银行借款10.8亿元与跟踪报告未用授信47亿元尚未对齐。原2024/2025再融资5.0/4.5及加权4.65仅保留为条件分支，不能因额度总数或一季度有借款就视为已验证；差额原因和可提款条件须核，未用额度未计入已落实现金。</w:t>
       </w:r>
     </w:p>
     <w:p>
@@ -18311,22 +18611,52 @@
         <w:pStyle w:val="Heading2"/>
       </w:pPr>
       <w:r>
-        <w:t>ks_a_pending_contingent 底层事实进一步核验</w:t>
-      </w:r>
-    </w:p>
-    <w:p>
-      <w:r>
-        <w:t>状态 awaiting_data；认定 存在性、完整性、计价、权利义务；总体 对应底层余额、合同、交易和期后事项；选取 尚未取得总体，不预称已抽样。</w:t>
-      </w:r>
-    </w:p>
-    <w:p>
-      <w:r>
-        <w:t>银行授信合同可提条件、保证/保函对手清单和代偿历史、诉讼律师意见、产品质量预计负债测算。</w:t>
-      </w:r>
-    </w:p>
-    <w:p>
-      <w:r>
-        <w:t>实际结果：未实施；公开资料不足以替代函证、凭证、合同或现场验证。；证据 。</w:t>
+        <w:t>ks_a_pending_contingent 经销保证完整性、存续状态与回款—代偿联动核验</w:t>
+      </w:r>
+    </w:p>
+    <w:p>
+      <w:r>
+        <w:t>状态 awaiting_data；认定 完整性、权利义务、计价、准确性、范围与截止；总体 年末39户/160,098,145.60元经销保证，滚动至2026-03-31披露7,655.11万元及2026-06-30；集团内担保、保函、诉讼及质保分别成表，合同总体尚未取得；选取 前十笔按金额及三月至六月到期集中全查，同时全查新增、展期、逾期、争议、追偿和代偿；取得剩余29户总体后按金额与风险决定进一步取证，不由前十笔外推。</w:t>
+      </w:r>
+    </w:p>
+    <w:p>
+      <w:r>
+        <w:t>取得担保台账、基础借款和保证合同、展期及解除文件、银行直接证据，与董事会/授信清单、总账和法务台账双向核完整性。</w:t>
+      </w:r>
+    </w:p>
+    <w:p>
+      <w:r>
+        <w:t>按户分别列期初、新增、续期、偿还、解除、被追偿及实际代偿，桥接年末—三月—六月；前十名匿名披露须有受控对应表，不能猜测客户身份。</w:t>
+      </w:r>
+    </w:p>
+    <w:p>
+      <w:r>
+        <w:t>核基础贷款实际偿还、余额及逾期，保证期间、索赔与法律责任终止；区分担保到期日、基础贷款到期日、付款要求日和实际代偿日。</w:t>
+      </w:r>
+    </w:p>
+    <w:p>
+      <w:r>
+        <w:t>逐户匹配银行放款、客户付科顺货款及发票/应收结算，拆新销售、旧款清收、预收和贷款周转；汇总本期实际保证支持收现，不以存量余额替代。</w:t>
+      </w:r>
+    </w:p>
+    <w:p>
+      <w:r>
+        <w:t>对代偿及预期信用损失核反担保权属、顺位、执行、变现净额与时间；先列毛付款，再列可证明的追偿，不用抵押估值抵销即期现金。</w:t>
+      </w:r>
+    </w:p>
+    <w:p>
+      <w:r>
+        <w:t>合并同一客户回款延迟、销售变化及代偿现金情景并去重；集团内保证与已并表基础债务仅列一次，核真正付款法人和资金来源。</w:t>
+      </w:r>
+    </w:p>
+    <w:p>
+      <w:r>
+        <w:t>另核保函索赔、重大诉讼律师证据及质保预计负债；输出逐项已核/未决及剩余总体，分别更新损失计量、现金资源、融资和未覆盖的评级调整。</w:t>
+      </w:r>
+    </w:p>
+    <w:p>
+      <w:r>
+        <w:t>实际结果：公开期限表、季度分组余额和用途机制已读并复算，详见ks_credit_proc_public；本程序所列银行/客户/合同及法律证据仍未取得，未实施逐户解除和现金链测试。；证据 ks_credit_e_dealer_schedule, ks_credit_e_guarantee_q1, ks_credit_e_dealer_use, ks_credit_e_yearend_settlement。</w:t>
       </w:r>
     </w:p>
     <w:p>
@@ -18540,17 +18870,37 @@
         <w:pStyle w:val="Heading2"/>
       </w:pPr>
       <w:r>
-        <w:t>ks_a_req_scope 待补资料</w:t>
-      </w:r>
-    </w:p>
-    <w:p>
-      <w:r>
-        <w:t>取得横琴同控重述后的2023合并全套报表、调整分录和2024/2023比较明细；解释丰泽范围影响。</w:t>
-      </w:r>
-    </w:p>
-    <w:p>
-      <w:r>
-        <w:t>影响：历史趋势是否同口径？ 所需资料用于检验该判断的金额、期限或执行依据。。责任角色：发行人财务/法务及独立核查方。关闭条件：取得重述调整表后先重建同口径期初和历史指标，再判断变化是否跨越因素档位；仅补齐摘要利润不足以关闭债务及周转分母。</w:t>
+        <w:t>ks_credit_proc_public 公开披露金额、期限列和最新余额复核</w:t>
+      </w:r>
+    </w:p>
+    <w:p>
+      <w:r>
+        <w:t>状态 performed；认定 准确性、范围与截止、列报；总体 2025年报PDF218、227—228；2026跟踪报告PDF17；2026-016 PDF1—4；2024保荐核查意见PDF2—3；选取 完整核对所列原页，逐项抄取年末前十笔和其他29户合计，并读取期后公告；不是合同总体抽样。</w:t>
+      </w:r>
+    </w:p>
+    <w:p>
+      <w:r>
+        <w:t>核跨页表头、原单位、时点及担保到期日；保留匿名标识和缺失的其他29户日期。</w:t>
+      </w:r>
+    </w:p>
+    <w:p>
+      <w:r>
+        <w:t>以calculate复算前十笔、六月七笔、全部39户总额及占比；按万元转元勾稽三月内外实际余额及季度变化。</w:t>
+      </w:r>
+    </w:p>
+    <w:p>
+      <w:r>
+        <w:t>对照同称年末的10.8/47亿元未用披露，保留名义差额，不自行解释或填入可用现金。</w:t>
+      </w:r>
+    </w:p>
+    <w:p>
+      <w:r>
+        <w:t>读取被担保贷款付公司货款及年末清款机制，区分公司、保荐人和原评级机构的陈述与本次实际工作。</w:t>
+      </w:r>
+    </w:p>
+    <w:p>
+      <w:r>
+        <w:t>实际结果：已核原页列位和披露时点；年末明细及三月内外分组加总残差均为零。已识别授信披露冲突、期限集中及三月余额下降反证；未执行银行函证、合同测试、逐户解除核验或原评级师信用调查。；证据 ks_credit_e_facilities, ks_credit_e_dealer_schedule, ks_credit_e_guarantee_q1, ks_credit_e_guarantee_approval, ks_credit_e_dealer_use, ks_credit_e_yearend_settlement。</w:t>
       </w:r>
     </w:p>
     <w:p>
@@ -18558,17 +18908,37 @@
         <w:pStyle w:val="Heading2"/>
       </w:pPr>
       <w:r>
-        <w:t>ks_a_req_ar 待补资料</w:t>
-      </w:r>
-    </w:p>
-    <w:p>
-      <w:r>
-        <w:t>客户逐笔期后银行收现、账龄及重组台账，单项和组合ECL参数、抵债估值及担保可执行证据。</w:t>
-      </w:r>
-    </w:p>
-    <w:p>
-      <w:r>
-        <w:t>影响：净应收下降是否证明回收风险消除？ 所需资料用于检验该判断的金额、期限或执行依据。。责任角色：发行人财务/法务及独立核查方。关闭条件：取得逐笔期后现金回收、第三方确认、债务重组执行和ECL参数后，重估损失覆盖、回收速度和资产可用性。</w:t>
+        <w:t>ks_credit_pending_facilities 解决授信披露冲突并核付款日前可用融资</w:t>
+      </w:r>
+    </w:p>
+    <w:p>
+      <w:r>
+        <w:t>状态 awaiting_data；认定 完整性、准确性、权利义务、范围与截止；总体 两个截至2025-12-31的银行额度披露所涉全部法人、银行、品种及协议，延伸至2026-06-30和展望期逐笔到期/提款计划；总体尚未取得；选取 对构成36.2亿元差额的所有项目全量桥接；逐笔核所有拟用于覆盖付款缺口的融资，另检查共享额度、撤销/到期、违约交叉及受限产品。</w:t>
+      </w:r>
+    </w:p>
+    <w:p>
+      <w:r>
+        <w:t>分别取得年报10.8亿元及跟踪报告47亿元的编制明细，按法人—银行—合同—产品匹配总额、已用、未用；列重复、范围差异及未解释项。</w:t>
+      </w:r>
+    </w:p>
+    <w:p>
+      <w:r>
+        <w:t>核银行直接证明、签署合同及修订，分可撤销/承诺、借款/票据/保函、循环/共享额度；核抵质押、保证金、财务约束、提款先决条件及有效期。</w:t>
+      </w:r>
+    </w:p>
+    <w:p>
+      <w:r>
+        <w:t>将每笔已证实可提款金额、币种、可到款日和收款法人，与同日到期债务及用途限制对应，不能以子公司额度替代母公司已可调用资金。</w:t>
+      </w:r>
+    </w:p>
+    <w:p>
+      <w:r>
+        <w:t>用实际期后提款、偿还及协议变化更新可用余额；剔除未落实和重复资源，重算现金时点和融资能力，再判断原4.65条件分支能否保留。</w:t>
+      </w:r>
+    </w:p>
+    <w:p>
+      <w:r>
+        <w:t>实际结果：仅完成公开披露对照；未取得完整合同总体、银行直接确认或逐笔付款资源表。金额冲突及评级资金前提尚未关闭。；证据 ks_a_e_maturity, ks_credit_e_facilities。</w:t>
       </w:r>
     </w:p>
     <w:p>
@@ -18576,17 +18946,17 @@
         <w:pStyle w:val="Heading2"/>
       </w:pPr>
       <w:r>
-        <w:t>ks_a_req_otherar 待补资料</w:t>
-      </w:r>
-    </w:p>
-    <w:p>
-      <w:r>
-        <w:t>中天盈等重组协议、期后收款、权属/抵押及关联交易审批定价支持。</w:t>
-      </w:r>
-    </w:p>
-    <w:p>
-      <w:r>
-        <w:t>影响：重组款是否具备兑现条件？ 所需资料用于检验该判断的金额、期限或执行依据。。责任角色：发行人财务/法务及独立核查方。关闭条件：取得已交割权属、真实期后到账及担保人的独立资源证明后，逐笔更新回收额与时点；资产转让协议签署不等于收到现金。</w:t>
+        <w:t>ks_a_req_scope 待补资料</w:t>
+      </w:r>
+    </w:p>
+    <w:p>
+      <w:r>
+        <w:t>取得横琴同控重述后的2023合并全套报表、调整分录和2024/2023比较明细；解释丰泽范围影响。</w:t>
+      </w:r>
+    </w:p>
+    <w:p>
+      <w:r>
+        <w:t>影响：历史趋势是否同口径？ 所需资料用于检验该判断的金额、期限或执行依据。。责任角色：发行人财务/法务及独立核查方。关闭条件：取得重述调整表后先重建同口径期初和历史指标，再判断变化是否跨越因素档位；仅补齐摘要利润不足以关闭债务及周转分母。</w:t>
       </w:r>
     </w:p>
     <w:p>
@@ -18594,17 +18964,17 @@
         <w:pStyle w:val="Heading2"/>
       </w:pPr>
       <w:r>
-        <w:t>ks_a_req_contract 待补资料</w:t>
-      </w:r>
-    </w:p>
-    <w:p>
-      <w:r>
-        <w:t>主要工程合同、客户确认工程量、变更索赔、预计总成本、质保及期后结算，执行截止测试。</w:t>
-      </w:r>
-    </w:p>
-    <w:p>
-      <w:r>
-        <w:t>影响：工程进度、质保及结算会否改变利润和现金？ 所需资料用于检验该判断的金额、期限或执行依据。。责任角色：发行人财务/法务及独立核查方。关闭条件：将主要工程履约进度、客户签认、合同总价及最新预计成本逐项桥接，复核期后结算及退款后，区分正常结算周期与减值或收入截止问题。</w:t>
+        <w:t>ks_a_req_ar 待补资料</w:t>
+      </w:r>
+    </w:p>
+    <w:p>
+      <w:r>
+        <w:t>客户逐笔期后银行收现、账龄及重组台账，单项和组合ECL参数、抵债估值及担保可执行证据。</w:t>
+      </w:r>
+    </w:p>
+    <w:p>
+      <w:r>
+        <w:t>影响：净应收下降是否证明回收风险消除？ 所需资料用于检验该判断的金额、期限或执行依据。。责任角色：发行人财务/法务及独立核查方。关闭条件：取得逐笔期后现金回收、第三方确认、债务重组执行和ECL参数后，重估损失覆盖、回收速度和资产可用性。</w:t>
       </w:r>
     </w:p>
     <w:p>
@@ -18612,17 +18982,17 @@
         <w:pStyle w:val="Heading2"/>
       </w:pPr>
       <w:r>
-        <w:t>ks_a_req_cash 待补资料</w:t>
-      </w:r>
-    </w:p>
-    <w:p>
-      <w:r>
-        <w:t>银行函证及资金流水、全部质押冻结/募集金/理财协议和集团资金上划限制，确认真正可动用现金。</w:t>
-      </w:r>
-    </w:p>
-    <w:p>
-      <w:r>
-        <w:t>影响：账面现金可多少用于一般偿债？ 所需资料用于检验该判断的金额、期限或执行依据。。责任角色：发行人财务/法务及独立核查方。关闭条件：确认银行函证、全部账户用途及理财/票据变现条件后，修订自由现金和现金类短债覆盖。</w:t>
+        <w:t>ks_a_req_otherar 待补资料</w:t>
+      </w:r>
+    </w:p>
+    <w:p>
+      <w:r>
+        <w:t>中天盈等重组协议、期后收款、权属/抵押及关联交易审批定价支持。</w:t>
+      </w:r>
+    </w:p>
+    <w:p>
+      <w:r>
+        <w:t>影响：重组款是否具备兑现条件？ 所需资料用于检验该判断的金额、期限或执行依据。。责任角色：发行人财务/法务及独立核查方。关闭条件：取得已交割权属、真实期后到账及担保人的独立资源证明后，逐笔更新回收额与时点；资产转让协议签署不等于收到现金。</w:t>
       </w:r>
     </w:p>
     <w:p>
@@ -18630,17 +19000,17 @@
         <w:pStyle w:val="Heading2"/>
       </w:pPr>
       <w:r>
-        <w:t>ks_a_req_supplier 待补资料</w:t>
-      </w:r>
-    </w:p>
-    <w:p>
-      <w:r>
-        <w:t>逐笔供应商融资协议和账期、平台已付供应商核对、AP转借款现金与非现金分类、追索条件。</w:t>
-      </w:r>
-    </w:p>
-    <w:p>
-      <w:r>
-        <w:t>影响：供应商融资是否重复计债或掩盖营运资金压力？ 所需资料用于检验该判断的金额、期限或执行依据。。责任角色：发行人财务/法务及独立核查方。关闭条件：取得融资协议、付款展期和追索安排后确定AP部分重分类；核对银行流水后再调整现金流。</w:t>
+        <w:t>ks_a_req_contract 待补资料</w:t>
+      </w:r>
+    </w:p>
+    <w:p>
+      <w:r>
+        <w:t>主要工程合同、客户确认工程量、变更索赔、预计总成本、质保及期后结算，执行截止测试。</w:t>
+      </w:r>
+    </w:p>
+    <w:p>
+      <w:r>
+        <w:t>影响：工程进度、质保及结算会否改变利润和现金？ 所需资料用于检验该判断的金额、期限或执行依据。。责任角色：发行人财务/法务及独立核查方。关闭条件：将主要工程履约进度、客户签认、合同总价及最新预计成本逐项桥接，复核期后结算及退款后，区分正常结算周期与减值或收入截止问题。</w:t>
       </w:r>
     </w:p>
     <w:p>
@@ -18648,17 +19018,17 @@
         <w:pStyle w:val="Heading2"/>
       </w:pPr>
       <w:r>
-        <w:t>ks_a_req_fixed 待补资料</w:t>
-      </w:r>
-    </w:p>
-    <w:p>
-      <w:r>
-        <w:t>存货库龄及售价，闲置产线处置/复产计划、现金产出单元测试、土地房产权证、商誉测算及外部估值。</w:t>
-      </w:r>
-    </w:p>
-    <w:p>
-      <w:r>
-        <w:t>影响：低利用率及项目延期的账面价值有无压力？ 所需资料用于检验该判断的金额、期限或执行依据。。责任角色：发行人财务/法务及独立核查方。关闭条件：逐产线取得产能、利用率、订单、维护支出、处置报价及权属证据，并用实际经营偏差检验现金产出单元预测；验证后重估减值和未来资本需求。</w:t>
+        <w:t>ks_a_req_cash 待补资料</w:t>
+      </w:r>
+    </w:p>
+    <w:p>
+      <w:r>
+        <w:t>银行函证及资金流水、全部质押冻结/募集金/理财协议和集团资金上划限制，确认真正可动用现金。</w:t>
+      </w:r>
+    </w:p>
+    <w:p>
+      <w:r>
+        <w:t>影响：账面现金可多少用于一般偿债？ 所需资料用于检验该判断的金额、期限或执行依据。。责任角色：发行人财务/法务及独立核查方。关闭条件：确认银行函证、全部账户用途及理财/票据变现条件后，修订自由现金和现金类短债覆盖。</w:t>
       </w:r>
     </w:p>
     <w:p>
@@ -18666,17 +19036,17 @@
         <w:pStyle w:val="Heading2"/>
       </w:pPr>
       <w:r>
-        <w:t>ks_a_req_cip 待补资料</w:t>
-      </w:r>
-    </w:p>
-    <w:p>
-      <w:r>
-        <w:t>滁州一期重要在建表各列至总账明细的完整桥、其他减少内容、转固验收及资本化利息计算。</w:t>
-      </w:r>
-    </w:p>
-    <w:p>
-      <w:r>
-        <w:t>影响：原表列位误读能否解释差额？ 所需资料用于检验该判断的金额、期限或执行依据。。责任角色：发行人财务/法务及独立核查方。关闭条件：取得滁州项目逐笔期初、增加、转固、其他减少和期末桥，定位差额对应的会计科目、期间及是否影响本期损益，再撤回或确认疑点。</w:t>
+        <w:t>ks_a_req_supplier 待补资料</w:t>
+      </w:r>
+    </w:p>
+    <w:p>
+      <w:r>
+        <w:t>逐笔供应商融资协议和账期、平台已付供应商核对、AP转借款现金与非现金分类、追索条件。</w:t>
+      </w:r>
+    </w:p>
+    <w:p>
+      <w:r>
+        <w:t>影响：供应商融资是否重复计债或掩盖营运资金压力？ 所需资料用于检验该判断的金额、期限或执行依据。。责任角色：发行人财务/法务及独立核查方。关闭条件：取得融资协议、付款展期和追索安排后确定AP部分重分类；核对银行流水后再调整现金流。</w:t>
       </w:r>
     </w:p>
     <w:p>
@@ -18684,17 +19054,17 @@
         <w:pStyle w:val="Heading2"/>
       </w:pPr>
       <w:r>
-        <w:t>ks_a_req_tax 待补资料</w:t>
-      </w:r>
-    </w:p>
-    <w:p>
-      <w:r>
-        <w:t>提供已确认DTA按纳税主体和税区的明细、已确认亏损发生年度与到期表、税前扣除条件及限制、差异转回计划和预计适用税率；将未来应税利润预算与订单/经营预测、应税暂时性差异转回逐项对应，标明优惠资格及有效期。</w:t>
-      </w:r>
-    </w:p>
-    <w:p>
-      <w:r>
-        <w:t>影响：减值及亏损DTA构成主要税务资产，未确认亏损的期限表和集团利润不足以支持已确认部分可实现性；需要检验利润缓冲及资本质量。。责任角色：发行人财务与税务负责人。关闭条件：在同一纳税主体、税区和可用期间内证明可抵扣额，排除重复使用未来应税利润；按结果确定可实现DTA及资本影响，无法证实的部分保留不确定性，不机械全额减记。</w:t>
+        <w:t>ks_a_req_fixed 待补资料</w:t>
+      </w:r>
+    </w:p>
+    <w:p>
+      <w:r>
+        <w:t>存货库龄及售价，闲置产线处置/复产计划、现金产出单元测试、土地房产权证、商誉测算及外部估值。</w:t>
+      </w:r>
+    </w:p>
+    <w:p>
+      <w:r>
+        <w:t>影响：低利用率及项目延期的账面价值有无压力？ 所需资料用于检验该判断的金额、期限或执行依据。。责任角色：发行人财务/法务及独立核查方。关闭条件：逐产线取得产能、利用率、订单、维护支出、处置报价及权属证据，并用实际经营偏差检验现金产出单元预测；验证后重估减值和未来资本需求。</w:t>
       </w:r>
     </w:p>
     <w:p>
@@ -18702,17 +19072,17 @@
         <w:pStyle w:val="Heading2"/>
       </w:pPr>
       <w:r>
-        <w:t>ks_a_req_parent 待补资料</w:t>
-      </w:r>
-    </w:p>
-    <w:p>
-      <w:r>
-        <w:t>集团往来合同及账龄、现金归集限制、子公司分红决策和上划凭证，发行主体未来一年资金计划。</w:t>
-      </w:r>
-    </w:p>
-    <w:p>
-      <w:r>
-        <w:t>影响：合并现金能否直接供发行主体偿债？ 所需资料用于检验该判断的金额、期限或执行依据。。责任角色：发行人财务/法务及独立核查方。关闭条件：取得母公司债务到期表、子公司上划决议与现金到账、资金归集合同及往来可回收证据后判断发行主体资源。</w:t>
+        <w:t>ks_a_req_cip 待补资料</w:t>
+      </w:r>
+    </w:p>
+    <w:p>
+      <w:r>
+        <w:t>滁州一期重要在建表各列至总账明细的完整桥、其他减少内容、转固验收及资本化利息计算。</w:t>
+      </w:r>
+    </w:p>
+    <w:p>
+      <w:r>
+        <w:t>影响：原表列位误读能否解释差额？ 所需资料用于检验该判断的金额、期限或执行依据。。责任角色：发行人财务/法务及独立核查方。关闭条件：取得滁州项目逐笔期初、增加、转固、其他减少和期末桥，定位差额对应的会计科目、期间及是否影响本期损益，再撤回或确认疑点。</w:t>
       </w:r>
     </w:p>
     <w:p>
@@ -18720,17 +19090,17 @@
         <w:pStyle w:val="Heading2"/>
       </w:pPr>
       <w:r>
-        <w:t>ks_a_req_contingent 待补资料</w:t>
-      </w:r>
-    </w:p>
-    <w:p>
-      <w:r>
-        <w:t>银行授信合同可提条件、保证/保函对手清单和代偿历史、诉讼律师意见、产品质量预计负债测算。</w:t>
-      </w:r>
-    </w:p>
-    <w:p>
-      <w:r>
-        <w:t>影响：表外及或有负担是否被财务比率遗漏？ 所需资料用于检验该判断的金额、期限或执行依据。。责任角色：发行人财务/法务及独立核查方。关闭条件：取得债权人、被担保人、已提款余额、追索顺位、反担保资产及触发事件后，按同一经济义务去重并重算或有现金和回收。</w:t>
+        <w:t>ks_a_req_tax 待补资料</w:t>
+      </w:r>
+    </w:p>
+    <w:p>
+      <w:r>
+        <w:t>提供已确认DTA按纳税主体和税区的明细、已确认亏损发生年度与到期表、税前扣除条件及限制、差异转回计划和预计适用税率；将未来应税利润预算与订单/经营预测、应税暂时性差异转回逐项对应，标明优惠资格及有效期。</w:t>
+      </w:r>
+    </w:p>
+    <w:p>
+      <w:r>
+        <w:t>影响：减值及亏损DTA构成主要税务资产，未确认亏损的期限表和集团利润不足以支持已确认部分可实现性；需要检验利润缓冲及资本质量。。责任角色：发行人财务与税务负责人。关闭条件：在同一纳税主体、税区和可用期间内证明可抵扣额，排除重复使用未来应税利润；按结果确定可实现DTA及资本影响，无法证实的部分保留不确定性，不机械全额减记。</w:t>
       </w:r>
     </w:p>
     <w:p>
@@ -18738,17 +19108,17 @@
         <w:pStyle w:val="Heading2"/>
       </w:pPr>
       <w:r>
-        <w:t>ks_a_req_proceeds 待补资料</w:t>
-      </w:r>
-    </w:p>
-    <w:p>
-      <w:r>
-        <w:t>取得混用期间逐笔银行流水与用途追踪、专户整改执行、截至研究截止日新轮实际占用及募投资金需求。旧轮归还和新轮授权公告已取得，不再请求重复证明授权时点。</w:t>
-      </w:r>
-    </w:p>
-    <w:p>
-      <w:r>
-        <w:t>影响：年末余额与期后归还续作能否衔接？ 所需资料用于检验该判断的金额、期限或执行依据。。责任角色：发行人财务/法务及独立核查方。关闭条件：以截止日实际占用和用途流水确认应恢复额度、时间及项目需求，并验证混用问题整改执行；已公开的旧轮归还时点不再重复请求。</w:t>
+        <w:t>ks_a_req_parent 待补资料</w:t>
+      </w:r>
+    </w:p>
+    <w:p>
+      <w:r>
+        <w:t>集团往来合同及账龄、现金归集限制、子公司分红决策和上划凭证，发行主体未来一年资金计划。</w:t>
+      </w:r>
+    </w:p>
+    <w:p>
+      <w:r>
+        <w:t>影响：合并现金能否直接供发行主体偿债？ 所需资料用于检验该判断的金额、期限或执行依据。。责任角色：发行人财务/法务及独立核查方。关闭条件：取得母公司债务到期表、子公司上划决议与现金到账、资金归集合同及往来可回收证据后判断发行主体资源。</w:t>
       </w:r>
     </w:p>
     <w:p>
@@ -18756,17 +19126,17 @@
         <w:pStyle w:val="Heading2"/>
       </w:pPr>
       <w:r>
-        <w:t>ks_a_req_q1 待补资料</w:t>
-      </w:r>
-    </w:p>
-    <w:p>
-      <w:r>
-        <w:t>研究截止日前银行债务、受限现金、应收期后回收、授信可用额及同比同控比较调整。</w:t>
-      </w:r>
-    </w:p>
-    <w:p>
-      <w:r>
-        <w:t>影响：年度弱项是否在研究截止日前消除？ 所需资料用于检验该判断的金额、期限或执行依据。。责任角色：发行人财务/法务及独立核查方。关闭条件：取得半年度完整附注后，用原年度及一季度桥拆出季节性、范围、应收回款与新债；持续现金改善且债务到期与资金用途匹配才支持提高判断。</w:t>
+        <w:t>ks_a_req_contingent 待补资料</w:t>
+      </w:r>
+    </w:p>
+    <w:p>
+      <w:r>
+        <w:t>提供39户保证的年末至三月及六月逐户滚动、前十名受控身份对应、基础借款/保证/展期/解除合同与银行确认；经销贷款到账—付本公司货款—发票/应收结算配对；追偿/代偿历史及反担保权属顺位和现金时点。集团内担保、保函、诉讼及质保资料单列。</w:t>
+      </w:r>
+    </w:p>
+    <w:p>
+      <w:r>
+        <w:t>影响：核原表六月七笔到期集中与三月余额下降能否对应实际解除，检验保证支持收现的持续性及同一客户压力下的现金/损失传导。。责任角色：发行人财务/法务及独立核查方。关闭条件：全量滚动闭合到最新时点，重点逐户状态由直接证据支持；剩余总体和未决明确，回款、毛代偿、追偿及并表债务去重后进入现金和评级分析，不能只以余额下降或公司声明关闭。</w:t>
       </w:r>
     </w:p>
     <w:p>
@@ -18774,17 +19144,17 @@
         <w:pStyle w:val="Heading2"/>
       </w:pPr>
       <w:r>
-        <w:t>ks_b_req_channels 待补资料</w:t>
-      </w:r>
-    </w:p>
-    <w:p>
-      <w:r>
-        <w:t>提供直销、经销、零售、海外及非房客户收入与现金回款分表，并说明分类及关联变化。</w:t>
-      </w:r>
-    </w:p>
-    <w:p>
-      <w:r>
-        <w:t>影响：检验多元化是否已形成独立现金来源，并解释收入下降与收现改善的机制。。责任角色：发行人财务及经营管理部门。关闭条件：取得可与合并收入、回款及客户明细勾稽的完整期间数据。</w:t>
+        <w:t>ks_a_req_proceeds 待补资料</w:t>
+      </w:r>
+    </w:p>
+    <w:p>
+      <w:r>
+        <w:t>取得混用期间逐笔银行流水与用途追踪、专户整改执行、截至研究截止日新轮实际占用及募投资金需求。旧轮归还和新轮授权公告已取得，不再请求重复证明授权时点。</w:t>
+      </w:r>
+    </w:p>
+    <w:p>
+      <w:r>
+        <w:t>影响：年末余额与期后归还续作能否衔接？ 所需资料用于检验该判断的金额、期限或执行依据。。责任角色：发行人财务/法务及独立核查方。关闭条件：以截止日实际占用和用途流水确认应恢复额度、时间及项目需求，并验证混用问题整改执行；已公开的旧轮归还时点不再重复请求。</w:t>
       </w:r>
     </w:p>
     <w:p>
@@ -18792,17 +19162,17 @@
         <w:pStyle w:val="Heading2"/>
       </w:pPr>
       <w:r>
-        <w:t>ks_b_req_fund_status 待补资料</w:t>
-      </w:r>
-    </w:p>
-    <w:p>
-      <w:r>
-        <w:t>提供基金成立、认缴/实缴及关联关系变更时点，说明年度关联共同投资栏与专项公告的范围。</w:t>
-      </w:r>
-    </w:p>
-    <w:p>
-      <w:r>
-        <w:t>影响：区分长期承诺和已用现金、判断审批后实际执行及披露一致性。。责任角色：发行人董事会办公室及财务部门。关闭条件：原始协议、登记及银行支付记录与年报附注范围完成勾稽。</w:t>
+        <w:t>ks_a_req_q1 待补资料</w:t>
+      </w:r>
+    </w:p>
+    <w:p>
+      <w:r>
+        <w:t>研究截止日前银行债务、受限现金、应收期后回收、授信可用额及同比同控比较调整。</w:t>
+      </w:r>
+    </w:p>
+    <w:p>
+      <w:r>
+        <w:t>影响：年度弱项是否在研究截止日前消除？ 所需资料用于检验该判断的金额、期限或执行依据。。责任角色：发行人财务/法务及独立核查方。关闭条件：取得半年度完整附注后，用原年度及一季度桥拆出季节性、范围、应收回款与新债；持续现金改善且债务到期与资金用途匹配才支持提高判断。</w:t>
       </w:r>
     </w:p>
     <w:p>
@@ -18810,17 +19180,17 @@
         <w:pStyle w:val="Heading2"/>
       </w:pPr>
       <w:r>
-        <w:t>ks_d_req_covenant 待补资料</w:t>
-      </w:r>
-    </w:p>
-    <w:p>
-      <w:r>
-        <w:t>提供原持续承诺的正式适用期间和口径说明，以及以同一财报数字编制的逐期累计债券余额、净资产、排除项目和调整项目明细；如主张已变更或豁免，附具有生效依据的决议、公告及协议。</w:t>
-      </w:r>
-    </w:p>
-    <w:p>
-      <w:r>
-        <w:t>影响：需要解释研究账面比率 57.09% 与正常履行披露的差异；一般履约声明不足以替代具体计算。。责任角色：发行人财务及信息披露负责人；受托管理人提供核对依据。关闭条件：明细可追至原财报并完整调节差额，适用期与定义有原始法律文件支持；对是否不履约给出可核查的特定说明。</w:t>
+        <w:t>ks_b_req_channels 待补资料</w:t>
+      </w:r>
+    </w:p>
+    <w:p>
+      <w:r>
+        <w:t>提供直销、经销、零售、海外及非房客户收入与现金回款分表，并说明分类及关联变化。</w:t>
+      </w:r>
+    </w:p>
+    <w:p>
+      <w:r>
+        <w:t>影响：检验多元化是否已形成独立现金来源，并解释收入下降与收现改善的机制。。责任角色：发行人财务及经营管理部门。关闭条件：取得可与合并收入、回款及客户明细勾稽的完整期间数据。</w:t>
       </w:r>
     </w:p>
     <w:p>
@@ -18828,17 +19198,17 @@
         <w:pStyle w:val="Heading2"/>
       </w:pPr>
       <w:r>
-        <w:t>ks_d_req_trustee_agreement 待补资料</w:t>
-      </w:r>
-    </w:p>
-    <w:p>
-      <w:r>
-        <w:t>提供本次发行完整已签受托管理协议及补充、修订文本，定位义务并入、违约事件、通知、补救期限、加速权限和表决门槛、豁免与撤销加速条款。 对延期及可能的实际项目变化，提供截至截止日有关是否构成募集用途变更、附加回售触发的有效文件和受托管理人解释；如已触发，取得公告、申报窗口、有效申报规模和支付日期。</w:t>
-      </w:r>
-    </w:p>
-    <w:p>
-      <w:r>
-        <w:t>影响：募集书转介的具体救济没有全文；已取得会议规则只能证明集体决策程序，不能据此创造自动加速。。责任角色：发行人法务及债券受托管理人。关闭条件：取得真实有效完整文本及签署/修订适用证据，条款可逐项映射本案事实。 普通价格回售、附加回售和违约加速的各自适用窗口及触发证据分别闭合；已回售部分不再重复计入后续本金利息。</w:t>
+        <w:t>ks_b_req_fund_status 待补资料</w:t>
+      </w:r>
+    </w:p>
+    <w:p>
+      <w:r>
+        <w:t>提供基金成立、认缴/实缴及关联关系变更时点，说明年度关联共同投资栏与专项公告的范围。</w:t>
+      </w:r>
+    </w:p>
+    <w:p>
+      <w:r>
+        <w:t>影响：区分长期承诺和已用现金、判断审批后实际执行及披露一致性。。责任角色：发行人董事会办公室及财务部门。关闭条件：原始协议、登记及银行支付记录与年报附注范围完成勾稽。</w:t>
       </w:r>
     </w:p>
     <w:p>
@@ -18846,17 +19216,17 @@
         <w:pStyle w:val="Heading2"/>
       </w:pPr>
       <w:r>
-        <w:t>ks_d_req_funds 待补资料</w:t>
-      </w:r>
-    </w:p>
-    <w:p>
-      <w:r>
-        <w:t>提供新一期临时补流在截止日的专户及一般户对账、逐笔划出和归还记录、项目付款时间表及已占用营运资金回收计划。 结合四项项目延至2028年底，列新一期临时补流实际支用及最早项目资金需求日，按2026-01-09批准日起不超过12个月核定确切最终期限，并从2026-12-31至该边界逐笔列九日资金收支、其他应付款、最低营运需要、现金所属法人及母公司实际可调度安排；已归还额、仍占用额、未动用批准额度分列。未投入募集计划额度不能整体填为2026付款，也不得将未来批准续用假定为既定。</w:t>
-      </w:r>
-    </w:p>
-    <w:p>
-      <w:r>
-        <w:t>影响：已知授权上限 13.00 亿元人民币 不等于实际占用或可自由偿债现金；需量化到期恢复专户的资金安排。 延期不会自动延长2026年补流授权；现有模型止于2026年底，不能证明年初归还事件或连续12个月覆盖。需区分用途恢复与新增外部债务，避免与资本支出重复扣款。。责任角色：发行人财务、募集资金管理责任人及保荐机构。关闭条件：支用减归还可勾稽截止日实际占用，并与募集专户、一般账户及项目支付计划一致；避免与对外本金重复计入。 截止前已有证据和后续实际信息分开；实际归还需要与发行主体在相应日可调度现金及已落实安排相匹配，并将项目提前要款纳入同一时间轴。</w:t>
+        <w:t>ks_d_req_covenant 待补资料</w:t>
+      </w:r>
+    </w:p>
+    <w:p>
+      <w:r>
+        <w:t>提供原持续承诺的正式适用期间和口径说明，以及以同一财报数字编制的逐期累计债券余额、净资产、排除项目和调整项目明细；如主张已变更或豁免，附具有生效依据的决议、公告及协议。</w:t>
+      </w:r>
+    </w:p>
+    <w:p>
+      <w:r>
+        <w:t>影响：需要解释研究账面比率 57.09% 与正常履行披露的差异；一般履约声明不足以替代具体计算。。责任角色：发行人财务及信息披露负责人；受托管理人提供核对依据。关闭条件：明细可追至原财报并完整调节差额，适用期与定义有原始法律文件支持；对是否不履约给出可核查的特定说明。</w:t>
       </w:r>
     </w:p>
     <w:p>
@@ -18864,17 +19234,17 @@
         <w:pStyle w:val="Heading2"/>
       </w:pPr>
       <w:r>
-        <w:t>ks_d_req_face_cutoff 待补资料</w:t>
-      </w:r>
-    </w:p>
-    <w:p>
-      <w:r>
-        <w:t>提供截止日内已形成的登记结算余额或有效公开余额资料；只有截止日前可得证据才用于历史时点结论，后续季度公告单列后验更新。</w:t>
-      </w:r>
-    </w:p>
-    <w:p>
-      <w:r>
-        <w:t>影响：现有最新已取得实际面值是 21.98 亿元人民币，其原始时点为一季度末，不能改写为六月末。。责任角色：发行人债券事务及登记结算资料管理责任人。关闭条件：原始日期、可得日期和面值变动可核验，并在保留旧节点的基础上重跑现金流情景。</w:t>
+        <w:t>ks_d_req_trustee_agreement 待补资料</w:t>
+      </w:r>
+    </w:p>
+    <w:p>
+      <w:r>
+        <w:t>提供本次发行完整已签受托管理协议及补充、修订文本，定位义务并入、违约事件、通知、补救期限、加速权限和表决门槛、豁免与撤销加速条款。 对延期及可能的实际项目变化，提供截至截止日有关是否构成募集用途变更、附加回售触发的有效文件和受托管理人解释；如已触发，取得公告、申报窗口、有效申报规模和支付日期。</w:t>
+      </w:r>
+    </w:p>
+    <w:p>
+      <w:r>
+        <w:t>影响：募集书转介的具体救济没有全文；已取得会议规则只能证明集体决策程序，不能据此创造自动加速。。责任角色：发行人法务及债券受托管理人。关闭条件：取得真实有效完整文本及签署/修订适用证据，条款可逐项映射本案事实。 普通价格回售、附加回售和违约加速的各自适用窗口及触发证据分别闭合；已回售部分不再重复计入后续本金利息。</w:t>
       </w:r>
     </w:p>
     <w:p>
@@ -18882,17 +19252,17 @@
         <w:pStyle w:val="Heading2"/>
       </w:pPr>
       <w:r>
-        <w:t>ks_r_req_bond_buckets 待补资料</w:t>
-      </w:r>
-    </w:p>
-    <w:p>
-      <w:r>
-        <w:t>说明年报未折现应付债券期限表的本金、各计息年度、现金日期及未来转股/行权假设，提供与募集说明书的调节。</w:t>
-      </w:r>
-    </w:p>
-    <w:p>
-      <w:r>
-        <w:t>影响：一年内披露额与固定同日面值的合同票息不同，影响短期现金预算及期限归属。。责任角色：发行人财务及债券受托管理人。关闭条件：原表与合同时间轴在一致假设下可复算，或有正式说明解释口径及剩余差额。</w:t>
+        <w:t>ks_d_req_funds 待补资料</w:t>
+      </w:r>
+    </w:p>
+    <w:p>
+      <w:r>
+        <w:t>提供新一期临时补流在截止日的专户及一般户对账、逐笔划出和归还记录、项目付款时间表及已占用营运资金回收计划。 结合四项项目延至2028年底，列新一期临时补流实际支用及最早项目资金需求日，按2026-01-09批准日起不超过12个月核定确切最终期限，并从2026-12-31至该边界逐笔列九日资金收支、其他应付款、最低营运需要、现金所属法人及母公司实际可调度安排；已归还额、仍占用额、未动用批准额度分列。未投入募集计划额度不能整体填为2026付款，也不得将未来批准续用假定为既定。</w:t>
+      </w:r>
+    </w:p>
+    <w:p>
+      <w:r>
+        <w:t>影响：已知授权上限 13.00 亿元人民币 不等于实际占用或可自由偿债现金；需量化到期恢复专户的资金安排。 延期不会自动延长2026年补流授权；现有模型止于2026年底，不能证明年初归还事件或连续12个月覆盖。需区分用途恢复与新增外部债务，避免与资本支出重复扣款。。责任角色：发行人财务、募集资金管理责任人及保荐机构。关闭条件：支用减归还可勾稽截止日实际占用，并与募集专户、一般账户及项目支付计划一致；避免与对外本金重复计入。 截止前已有证据和后续实际信息分开；实际归还需要与发行主体在相应日可调度现金及已落实安排相匹配，并将项目提前要款纳入同一时间轴。</w:t>
       </w:r>
     </w:p>
     <w:p>
@@ -18900,17 +19270,17 @@
         <w:pStyle w:val="Heading2"/>
       </w:pPr>
       <w:r>
-        <w:t>ks_project_req_project 待补资料</w:t>
-      </w:r>
-    </w:p>
-    <w:p>
-      <w:r>
-        <w:t>提供截至2026-06-30已有版本的更新项目现金模型，并将2023募集说明书T+6/104%示意测算逐项调节到最终115%合同及实际投产计划：区分项目、发行人和集团，列工程采购已签合同/取消权/付款日、销量价格订单和产能爬坡、营运资金回收、所得税与处置税费、资产权属抵押及可出售净额、资金上划条件与到账日；解释旧测算为何未同步最终价格。未来编制的新模型与截止日前已有模型分开。</w:t>
-      </w:r>
-    </w:p>
-    <w:p>
-      <w:r>
-        <w:t>影响：旧模型依赖终期变现，项目延期后原满产和回收时点缺乏更新桥；需要确认可执行偿债来源，而非再次调整已按115%计算的债务。。责任角色：发行人财务、项目负责人及受托管理人。关闭条件：原预测—实际进度—更新税后项目现金—可上划净额—合同付款日全链可复算；已落实资金与经营/出售/融资假设分列，无法取得的细项不填零。</w:t>
+        <w:t>ks_d_req_face_cutoff 待补资料</w:t>
+      </w:r>
+    </w:p>
+    <w:p>
+      <w:r>
+        <w:t>提供截止日内已形成的登记结算余额或有效公开余额资料；只有截止日前可得证据才用于历史时点结论，后续季度公告单列后验更新。</w:t>
+      </w:r>
+    </w:p>
+    <w:p>
+      <w:r>
+        <w:t>影响：现有最新已取得实际面值是 21.98 亿元人民币，其原始时点为一季度末，不能改写为六月末。。责任角色：发行人债券事务及登记结算资料管理责任人。关闭条件：原始日期、可得日期和面值变动可核验，并在保留旧节点的基础上重跑现金流情景。</w:t>
       </w:r>
     </w:p>
     <w:p>
@@ -18918,17 +19288,17 @@
         <w:pStyle w:val="Heading2"/>
       </w:pPr>
       <w:r>
-        <w:t>ks_horizon_request_execution 待补资料</w:t>
-      </w:r>
-    </w:p>
-    <w:p>
-      <w:r>
-        <w:t>提供截止日前已有的2026-07至2027-06逐月/关键日集团与母公司现金预算、银行/供应链/租赁逐笔到期表；2026预算还本与2026Q1债务逐笔对应；2027预计股利、资本开支合同及新增融资自身后续付款；临时补流实际未归还余额、专户重合及最早项目需用日；母公司可上划资金执行依据。</w:t>
-      </w:r>
-    </w:p>
-    <w:p>
-      <w:r>
-        <w:t>影响：D1/D2、X、U、P与发行人A_t尚未闭合。短借+一年内到期账面扣2026付款预算只能作库存筛查，不能认定2027真实本金下限。 Δ_A、Δ_H和Γ必须分离，H版净额约束中的κ_H2另行核实；实际全路径融资需要仍为null。。责任角色：发行人财务资金部/项目负责人/债务契约核查人员。关闭条件：逐笔核实到期及付款覆盖，验证用途恢复与项目支出只扣一次，并以到账证明及可执行融资承诺覆盖每一关键日期；季度末正数不足以关闭月内或发行人分支。 重跑三条2026路径、两条2027延伸及用途恢复静态观察，连同毛付款决定的M和各时点max融资需求；净CFO相符本身不能关闭。</w:t>
+        <w:t>ks_r_req_bond_buckets 待补资料</w:t>
+      </w:r>
+    </w:p>
+    <w:p>
+      <w:r>
+        <w:t>说明年报未折现应付债券期限表的本金、各计息年度、现金日期及未来转股/行权假设，提供与募集说明书的调节。</w:t>
+      </w:r>
+    </w:p>
+    <w:p>
+      <w:r>
+        <w:t>影响：一年内披露额与固定同日面值的合同票息不同，影响短期现金预算及期限归属。。责任角色：发行人财务及债券受托管理人。关闭条件：原表与合同时间轴在一致假设下可复算，或有正式说明解释口径及剩余差额。</w:t>
       </w:r>
     </w:p>
     <w:p>
@@ -18936,17 +19306,17 @@
         <w:pStyle w:val="Heading2"/>
       </w:pPr>
       <w:r>
-        <w:t>ks_horizon_request_scope_bridge 待补资料</w:t>
-      </w:r>
-    </w:p>
-    <w:p>
-      <w:r>
-        <w:t>提供截至2026-06-30已形成的2025Q1按半年报和年报各版本的销售、退款、其他经营收款、采购、职工、税费、其他经营付款及资本开支重述桥，逐项列目标主体现金和内部抵销；解释H1的2025-05-31与年报的2025-06-16合并日及合并日现金、合并前净利差异。提供顺控保理2025各季度至2025-11-30丧控日的现金及抵销明细、其他新设/注销的各季贡献，并核2026-03-31及2026-06-30持续经营范围。</w:t>
-      </w:r>
-    </w:p>
-    <w:p>
-      <w:r>
-        <w:t>影响：Δ_H与Δ_A分别未知；期初833421.24元存量差和季度净CFO一致不能识别毛额调整。范围调整会改变2026三情景及2027H1现金容量和融资需求。 Δ_A、Δ_H和Γ必须分离，H版净额约束中的κ_H2另行核实；实际全路径融资需要仍为null。。责任角色：发行人财务合并报表团队及年审会计师/资金部。关闭条件：在形成资金覆盖结论前完成版本桥；按2026-08-04付息窗口、2027-01-09最迟恢复用途窗口及2027-06-30观察期分配影响，逐项重算并以真实可得资金覆盖核实付款日。未取得毛额或抵销明细时保持开放，不以净额勾稽代替。 重跑三条2026路径、两条2027延伸及用途恢复静态观察，连同毛付款决定的M和各时点max融资需求；净CFO相符本身不能关闭。</w:t>
+        <w:t>ks_project_req_project 待补资料</w:t>
+      </w:r>
+    </w:p>
+    <w:p>
+      <w:r>
+        <w:t>提供截至2026-06-30已有版本的更新项目现金模型，并将2023募集说明书T+6/104%示意测算逐项调节到最终115%合同及实际投产计划：区分项目、发行人和集团，列工程采购已签合同/取消权/付款日、销量价格订单和产能爬坡、营运资金回收、所得税与处置税费、资产权属抵押及可出售净额、资金上划条件与到账日；解释旧测算为何未同步最终价格。未来编制的新模型与截止日前已有模型分开。</w:t>
+      </w:r>
+    </w:p>
+    <w:p>
+      <w:r>
+        <w:t>影响：旧模型依赖终期变现，项目延期后原满产和回收时点缺乏更新桥；需要确认可执行偿债来源，而非再次调整已按115%计算的债务。。责任角色：发行人财务、项目负责人及受托管理人。关闭条件：原预测—实际进度—更新税后项目现金—可上划净额—合同付款日全链可复算；已落实资金与经营/出售/融资假设分列，无法取得的细项不填零。</w:t>
       </w:r>
     </w:p>
     <w:p>
@@ -18954,6 +19324,42 @@
         <w:pStyle w:val="Heading2"/>
       </w:pPr>
       <w:r>
+        <w:t>ks_horizon_request_execution 待补资料</w:t>
+      </w:r>
+    </w:p>
+    <w:p>
+      <w:r>
+        <w:t>提供截止日前已有的2026-07至2027-06逐月/关键日集团与母公司现金预算、银行/供应链/租赁逐笔到期表；2026预算还本与2026Q1债务逐笔对应；2027预计股利、资本开支合同及新增融资自身后续付款；临时补流实际未归还余额、专户重合及最早项目需用日；母公司可上划资金执行依据。</w:t>
+      </w:r>
+    </w:p>
+    <w:p>
+      <w:r>
+        <w:t>影响：D1/D2、X、U、P与发行人A_t尚未闭合。短借+一年内到期账面扣2026付款预算只能作库存筛查，不能认定2027真实本金下限。 Δ_A、Δ_H和Γ必须分离，H版净额约束中的κ_H2另行核实；实际全路径融资需要仍为null。。责任角色：发行人财务资金部/项目负责人/债务契约核查人员。关闭条件：逐笔核实到期及付款覆盖，验证用途恢复与项目支出只扣一次，并以到账证明及可执行融资承诺覆盖每一关键日期；季度末正数不足以关闭月内或发行人分支。 重跑三条2026路径、两条2027延伸及用途恢复静态观察，连同毛付款决定的M和各时点max融资需求；净CFO相符本身不能关闭。</w:t>
+      </w:r>
+    </w:p>
+    <w:p>
+      <w:pPr>
+        <w:pStyle w:val="Heading2"/>
+      </w:pPr>
+      <w:r>
+        <w:t>ks_horizon_request_scope_bridge 待补资料</w:t>
+      </w:r>
+    </w:p>
+    <w:p>
+      <w:r>
+        <w:t>提供截至2026-06-30已形成的2025Q1按半年报和年报各版本的销售、退款、其他经营收款、采购、职工、税费、其他经营付款及资本开支重述桥，逐项列目标主体现金和内部抵销；解释H1的2025-05-31与年报的2025-06-16合并日及合并日现金、合并前净利差异。提供顺控保理2025各季度至2025-11-30丧控日的现金及抵销明细、其他新设/注销的各季贡献，并核2026-03-31及2026-06-30持续经营范围。</w:t>
+      </w:r>
+    </w:p>
+    <w:p>
+      <w:r>
+        <w:t>影响：Δ_H与Δ_A分别未知；期初833421.24元存量差和季度净CFO一致不能识别毛额调整。范围调整会改变2026三情景及2027H1现金容量和融资需求。 Δ_A、Δ_H和Γ必须分离，H版净额约束中的κ_H2另行核实；实际全路径融资需要仍为null。。责任角色：发行人财务合并报表团队及年审会计师/资金部。关闭条件：在形成资金覆盖结论前完成版本桥；按2026-08-04付息窗口、2027-01-09最迟恢复用途窗口及2027-06-30观察期分配影响，逐项重算并以真实可得资金覆盖核实付款日。未取得毛额或抵销明细时保持开放，不以净额勾稽代替。 重跑三条2026路径、两条2027延伸及用途恢复静态观察，连同毛付款决定的M和各时点max融资需求；净CFO相符本身不能关闭。</w:t>
+      </w:r>
+    </w:p>
+    <w:p>
+      <w:pPr>
+        <w:pStyle w:val="Heading2"/>
+      </w:pPr>
+      <w:r>
         <w:t>ks_tax_req_bridge 待补资料</w:t>
       </w:r>
     </w:p>
@@ -18965,6 +19371,24 @@
     <w:p>
       <w:r>
         <w:t>影响：确认损益税收益与余额变动差额的实际归属，避免把期末DTL余额当作当期权益流量或重复调整现金流。。责任角色：发行人财务与税务负责人。关闭条件：分录金额、期间、科目与附注及现金流补充资料一致；残差据实际来源说明，不能倒挤其他或把空白填零。</w:t>
+      </w:r>
+    </w:p>
+    <w:p>
+      <w:pPr>
+        <w:pStyle w:val="Heading2"/>
+      </w:pPr>
+      <w:r>
+        <w:t>ks_credit_req_facilities 待补资料</w:t>
+      </w:r>
+    </w:p>
+    <w:p>
+      <w:r>
+        <w:t>提供年报10.8亿元及跟踪报告47亿元未用额度的分别编制明细、73亿元总额对应表，按法人/银行/合同/产品列已用未用、共享额、抵质押/保证金、提款条件、撤销条款、有效期及期后实际提款；附银行直接证明和逐日付款资源表。</w:t>
+      </w:r>
+    </w:p>
+    <w:p>
+      <w:r>
+        <w:t>影响：同称年末但相差36.2亿元，尚未解释；不能据任一披露或再融资4.65研究分证明付款日前资金可得。。责任角色：发行人资金部门、相关银行及独立核查方。关闭条件：两来源总体差额逐项有证据解释，所有拟用于覆盖缺口的资金已核法人、时点、条件与金额；未落实部分排除后重算融资因素、现金及评级条件。</w:t>
       </w:r>
     </w:p>
     <w:p>
@@ -19310,11 +19734,11 @@
     </w:p>
     <w:p>
       <w:r>
-        <w:t>[ks_r_application] 2026科顺跟踪报告的方法适用性与通用等级定义页；公布 2026-06-23</w:t>
+        <w:t>[ks_r_application] 科顺防水科技股份有限公司可转换公司债券2026年跟踪评级报告；公布 2026-06-23</w:t>
         <w:br/>
         <w:t>https://www.lhratings.com/reports/B010330-P61284-2021-GZ2026.pdf</w:t>
         <w:br/>
-        <w:t>仅使用PDF6、8的方法适用性及23的通用等级/展望定义。发行人既有等级、机构因素得分和预测未作本案输入或校准目标。</w:t>
+        <w:t>使用PDF6、8的方法适用性、17（印刷14）的授信及经销商融资事实陈述、23的通用等级/展望定义。外部机构评级、因素得分、预测及评价结论未用作本案输入或校准目标；读取其公开陈述不等于重复执行其银行征信或合同核查。</w:t>
       </w:r>
     </w:p>
     <w:p>
@@ -19355,6 +19779,24 @@
     </w:p>
     <w:p>
       <w:r>
+        <w:t>[ks_credit_s_guarantee_q1] 科顺股份关于为全资子公司提供担保的公告（2026-016）；公布 2026-04-24</w:t>
+        <w:br/>
+        <w:t>https://static.cninfo.com.cn/finalpage/2026-04-24/1225172711.PDF</w:t>
+        <w:br/>
+        <w:t>分别记录截至2026-03-31实际担保余额与2026-04-23新增审批额度；公告未附逐笔解除或截至六月的担保台账。</w:t>
+      </w:r>
+    </w:p>
+    <w:p>
+      <w:r>
+        <w:t>[ks_credit_s_sponsor] 国泰君安证券关于科顺股份对外担保的核查意见；公布 2024-08-28</w:t>
+        <w:br/>
+        <w:t>https://static.cninfo.com.cn/finalpage/2024-08-28/1221008879.PDF</w:t>
+        <w:br/>
+        <w:t>使用PDF2—3披露的经销商保证安排、资金用途和反担保要求；只证明公开安排，不证明每笔贷款已按约执行或反担保可回收。</w:t>
+      </w:r>
+    </w:p>
+    <w:p>
+      <w:r>
         <w:t>[ks_a_e_coverage] ks_a_s_25 PDF页码与印刷页码一致。文本实际覆盖第1—92、97—245页；不使用第93—96页。选定表格46页提取矩阵；视觉读第114、119、125、128、185、208、209、210页；其余为文本及矩阵核读。2024补充只读第10、116—124、127—130、164、184、191、192、194、195、203、208—210页，未声称阅读全文。2026Q1全部12页文本已读。内控审计4页、自评11页、政策变更2页全部文本已读；募集资金鉴证11页，其中第10、11页为扫描图视觉阅读。 追加独立视觉复读2025第168页、2024第210页；补流归还及续作公告全部2页和6页已读。 2024年报第126、131—134页后续补读，含原2023合并权益变动表。 覆盖记录，阅读范围可由抽取文件及实际源页追溯；非审计保证</w:t>
       </w:r>
     </w:p>
@@ -20236,6 +20678,41 @@
     <w:p>
       <w:r>
         <w:t>[ks_tax_e_csrc5] ks_tax_s_csrc5 PDF/印刷第8—9页，5-8发行可转换债券的递延所得税会计处理。可转债为复合工具且负债计税基础等于票面金额并产生应税暂时性差异时，该差异来自权益成分，不满足DTL豁免条件，初始税影响计入权益；后续负债折价摊销的相关DTL变动计入损益。 证监会官方监管指引；提供准则执行口径，不能替代发行人当期分录及过渡处理披露。</w:t>
+      </w:r>
+    </w:p>
+    <w:p>
+      <w:r>
+        <w:t>[ks_earn_e_nonrec] ks_a_s_25 PDF第11—12页非经常性损益表（元）；第10、108、244页归母净利及扣非勾稽。原表依次为项目、2025年金额、2024年金额、2023年金额、说明。仅取前两期非空金额；2025资金占用费栏及2024同控合并栏为空，不填零。2025少数股东影响额为负数，按减项保留原符号。金融资产项目同时含公允价值和处置损益，不等同利润表公允价值变动科目。 完整官方年报；两期表头及金额列已回看原页</w:t>
+      </w:r>
+    </w:p>
+    <w:p>
+      <w:r>
+        <w:t>[ks_credit_e_facilities] ks_r_application PDF17/印刷14，偿债指标变化后授信段；截至2025年底，亿元。跟踪报告披露银行授信总额73.00、未使用47.00；同一时点年报PDF218披露未用银行借款额度108,000.00万元。用词不同不能解释或消除金额冲突，尚无按法人、银行、品种、已用/未用的逐项桥。 外部评级机构的公开事实陈述；不是银行确认。其额度、信用调查和风险判断未由本次重新验证，且不采用其评级或得分作校准。</w:t>
+      </w:r>
+    </w:p>
+    <w:p>
+      <w:r>
+        <w:t>[ks_credit_e_dealer_schedule] ks_a_s_25 PDF/印刷227—228，担保明细跨页表；2025-12-31，元。表头依次为被担保单位名称、担保事项、担保借款金额、担保到期日、备注。前十名逐笔有日期，余29家仅列总额且日期栏空白。全部为最高额连带责任保证；不将表列担保到期日改作基础贷款到期、实际代偿或法律责任已终止日期。 本次对原页跨页表头、金额及日期列视觉核对；匿名名称保持原样。未取得合同或银行解除证明。</w:t>
+      </w:r>
+    </w:p>
+    <w:p>
+      <w:r>
+        <w:t>[ks_credit_e_guarantee_q1] ks_credit_s_guarantee_q1 PDF3—4，第五节；截至2026-03-31，万元。公告披露实际担保总额19,710.32，集团内12,055.21，集团外经销商7,655.11；并声明无逾期、涉诉担保或因担保判决败诉承担损失。日期为三月末，未说明年末前十笔分别解除、展期或代偿情况，也未披露六月存续余额。 公司期后公告，未按逐笔合同验证。总额下降是正面反证，不能据此宣称全部担保已解除或截至六月无代偿。</w:t>
+      </w:r>
+    </w:p>
+    <w:p>
+      <w:r>
+        <w:t>[ks_credit_e_guarantee_approval] ks_credit_s_guarantee_q1 PDF1—3，第一、三节；2026-04-23审批，万元。重庆科顺供应链与广东顺采易新增审批担保额度分别30,000及6,000，合计36,000；公告说明尚未签担保协议，具体金额和期限待与金融机构协商签署。 审批额度与截至三月末实际余额的时点和性质不同；不是已发生新增义务或已落实融资，也不与并表债务重复加总。</w:t>
+      </w:r>
+    </w:p>
+    <w:p>
+      <w:r>
+        <w:t>[ks_credit_e_dealer_use] ks_credit_s_sponsor PDF2—3，第四及第五节。经销商贷款的合同安排要求融资后将货款汇入公司指定账户；披露贷款专用于支付公司货款、公司连带保证及反担保要求。 本次读取历史公开安排；未逐笔查银行放款、客户付款、原始销售及反担保执行，不冒记保荐人的核查为本次执行。</w:t>
+      </w:r>
+    </w:p>
+    <w:p>
+      <w:r>
+        <w:t>[ks_credit_e_yearend_settlement] ks_r_application PDF17/印刷14，授信段后经销商担保段。报告说明经销商被担保融资主要用于年底前结清其对公司应付货款。公司收现可能因此与对客户银行债务的或有风险同时存在；年末保证余额不是本年度保证支持的收款流量。 外部机构公开陈述，尚未核对逐笔借款及收现。其“或有负债风险较为可控”评价不作为本次已验证结论。</w:t>
       </w:r>
     </w:p>
     <w:sectPr>

</xml_diff>

<commit_message>
Reconcile issuer debt disclosures in Keshun example
</commit_message>
<xml_diff>
--- a/examples/keshun-2025/deliverables/report.docx
+++ b/examples/keshun-2025/deliverables/report.docx
@@ -65,7 +65,7 @@
     </w:p>
     <w:p>
       <w:r>
-        <w:t>2025年报PDF第1—92、97—245页完成文本阅读；第93—96页未读未用。视觉复核选页另见覆盖证据，不声称全文视觉审阅。</w:t>
+        <w:t>2025年报PDF第1—245页完成文本阅读；视觉复核仅为覆盖证据所列选页，包括补读的第83、95—96页，不声称全文视觉审阅。外部机构历史评级与本次研究判断分列，未作为因素输入或等级校准目标。</w:t>
       </w:r>
     </w:p>
     <w:p>
@@ -2938,6 +2938,857 @@
           </w:p>
         </w:tc>
       </w:tr>
+      <w:tr>
+        <w:trPr>
+          <w:cantSplit/>
+        </w:trPr>
+        <w:tc>
+          <w:tcPr>
+            <w:tcW w:type="dxa" w:w="3411"/>
+          </w:tcPr>
+          <w:p>
+            <w:r>
+              <w:t>发行人披露流动比率 [ks_a_reported_current_ratio_2025]</w:t>
+            </w:r>
+          </w:p>
+        </w:tc>
+        <w:tc>
+          <w:tcPr>
+            <w:tcW w:type="dxa" w:w="4386"/>
+          </w:tcPr>
+          <w:p>
+            <w:r>
+              <w:t>2025-12-31</w:t>
+              <w:br/>
+              <w:t>1.40 倍</w:t>
+            </w:r>
+          </w:p>
+        </w:tc>
+        <w:tc>
+          <w:tcPr>
+            <w:tcW w:type="dxa" w:w="1949"/>
+          </w:tcPr>
+          <w:p>
+            <w:r>
+              <w:t>ks_a_e_bond_metrics</w:t>
+            </w:r>
+          </w:p>
+        </w:tc>
+      </w:tr>
+      <w:tr>
+        <w:trPr>
+          <w:cantSplit/>
+        </w:trPr>
+        <w:tc>
+          <w:tcPr>
+            <w:tcW w:type="dxa" w:w="3411"/>
+          </w:tcPr>
+          <w:p>
+            <w:r>
+              <w:t>发行人披露流动比率 [ks_a_reported_current_ratio_2024]</w:t>
+            </w:r>
+          </w:p>
+        </w:tc>
+        <w:tc>
+          <w:tcPr>
+            <w:tcW w:type="dxa" w:w="4386"/>
+          </w:tcPr>
+          <w:p>
+            <w:r>
+              <w:t>2024-12-31</w:t>
+              <w:br/>
+              <w:t>1.62 倍</w:t>
+            </w:r>
+          </w:p>
+        </w:tc>
+        <w:tc>
+          <w:tcPr>
+            <w:tcW w:type="dxa" w:w="1949"/>
+          </w:tcPr>
+          <w:p>
+            <w:r>
+              <w:t>ks_a_e_bond_metrics</w:t>
+            </w:r>
+          </w:p>
+        </w:tc>
+      </w:tr>
+      <w:tr>
+        <w:trPr>
+          <w:cantSplit/>
+        </w:trPr>
+        <w:tc>
+          <w:tcPr>
+            <w:tcW w:type="dxa" w:w="3411"/>
+          </w:tcPr>
+          <w:p>
+            <w:r>
+              <w:t>发行人披露资产负债率 [ks_a_reported_liability_ratio_2025]</w:t>
+            </w:r>
+          </w:p>
+        </w:tc>
+        <w:tc>
+          <w:tcPr>
+            <w:tcW w:type="dxa" w:w="4386"/>
+          </w:tcPr>
+          <w:p>
+            <w:r>
+              <w:t>2025-12-31</w:t>
+              <w:br/>
+              <w:t>67.32%</w:t>
+            </w:r>
+          </w:p>
+        </w:tc>
+        <w:tc>
+          <w:tcPr>
+            <w:tcW w:type="dxa" w:w="1949"/>
+          </w:tcPr>
+          <w:p>
+            <w:r>
+              <w:t>ks_a_e_bond_metrics</w:t>
+            </w:r>
+          </w:p>
+        </w:tc>
+      </w:tr>
+      <w:tr>
+        <w:trPr>
+          <w:cantSplit/>
+        </w:trPr>
+        <w:tc>
+          <w:tcPr>
+            <w:tcW w:type="dxa" w:w="3411"/>
+          </w:tcPr>
+          <w:p>
+            <w:r>
+              <w:t>发行人披露资产负债率 [ks_a_reported_liability_ratio_2024]</w:t>
+            </w:r>
+          </w:p>
+        </w:tc>
+        <w:tc>
+          <w:tcPr>
+            <w:tcW w:type="dxa" w:w="4386"/>
+          </w:tcPr>
+          <w:p>
+            <w:r>
+              <w:t>2024-12-31</w:t>
+              <w:br/>
+              <w:t>64.18%</w:t>
+            </w:r>
+          </w:p>
+        </w:tc>
+        <w:tc>
+          <w:tcPr>
+            <w:tcW w:type="dxa" w:w="1949"/>
+          </w:tcPr>
+          <w:p>
+            <w:r>
+              <w:t>ks_a_e_bond_metrics</w:t>
+            </w:r>
+          </w:p>
+        </w:tc>
+      </w:tr>
+      <w:tr>
+        <w:trPr>
+          <w:cantSplit/>
+        </w:trPr>
+        <w:tc>
+          <w:tcPr>
+            <w:tcW w:type="dxa" w:w="3411"/>
+          </w:tcPr>
+          <w:p>
+            <w:r>
+              <w:t>发行人披露速动比率 [ks_a_reported_quick_ratio_2025]</w:t>
+            </w:r>
+          </w:p>
+        </w:tc>
+        <w:tc>
+          <w:tcPr>
+            <w:tcW w:type="dxa" w:w="4386"/>
+          </w:tcPr>
+          <w:p>
+            <w:r>
+              <w:t>2025-12-31</w:t>
+              <w:br/>
+              <w:t>1.26 倍</w:t>
+            </w:r>
+          </w:p>
+        </w:tc>
+        <w:tc>
+          <w:tcPr>
+            <w:tcW w:type="dxa" w:w="1949"/>
+          </w:tcPr>
+          <w:p>
+            <w:r>
+              <w:t>ks_a_e_bond_metrics</w:t>
+            </w:r>
+          </w:p>
+        </w:tc>
+      </w:tr>
+      <w:tr>
+        <w:trPr>
+          <w:cantSplit/>
+        </w:trPr>
+        <w:tc>
+          <w:tcPr>
+            <w:tcW w:type="dxa" w:w="3411"/>
+          </w:tcPr>
+          <w:p>
+            <w:r>
+              <w:t>发行人披露速动比率 [ks_a_reported_quick_ratio_2024]</w:t>
+            </w:r>
+          </w:p>
+        </w:tc>
+        <w:tc>
+          <w:tcPr>
+            <w:tcW w:type="dxa" w:w="4386"/>
+          </w:tcPr>
+          <w:p>
+            <w:r>
+              <w:t>2024-12-31</w:t>
+              <w:br/>
+              <w:t>1.47 倍</w:t>
+            </w:r>
+          </w:p>
+        </w:tc>
+        <w:tc>
+          <w:tcPr>
+            <w:tcW w:type="dxa" w:w="1949"/>
+          </w:tcPr>
+          <w:p>
+            <w:r>
+              <w:t>ks_a_e_bond_metrics</w:t>
+            </w:r>
+          </w:p>
+        </w:tc>
+      </w:tr>
+      <w:tr>
+        <w:trPr>
+          <w:cantSplit/>
+        </w:trPr>
+        <w:tc>
+          <w:tcPr>
+            <w:tcW w:type="dxa" w:w="3411"/>
+          </w:tcPr>
+          <w:p>
+            <w:r>
+              <w:t>发行人披露EBITDA全部债务比 [ks_a_reported_ebitda_debt_ratio_2025]</w:t>
+            </w:r>
+          </w:p>
+        </w:tc>
+        <w:tc>
+          <w:tcPr>
+            <w:tcW w:type="dxa" w:w="4386"/>
+          </w:tcPr>
+          <w:p>
+            <w:r>
+              <w:t>2025-12-31</w:t>
+              <w:br/>
+              <w:t>‑2.53%</w:t>
+            </w:r>
+          </w:p>
+        </w:tc>
+        <w:tc>
+          <w:tcPr>
+            <w:tcW w:type="dxa" w:w="1949"/>
+          </w:tcPr>
+          <w:p>
+            <w:r>
+              <w:t>ks_a_e_bond_metrics</w:t>
+            </w:r>
+          </w:p>
+        </w:tc>
+      </w:tr>
+      <w:tr>
+        <w:trPr>
+          <w:cantSplit/>
+        </w:trPr>
+        <w:tc>
+          <w:tcPr>
+            <w:tcW w:type="dxa" w:w="3411"/>
+          </w:tcPr>
+          <w:p>
+            <w:r>
+              <w:t>发行人披露EBITDA全部债务比 [ks_a_reported_ebitda_debt_ratio_2024]</w:t>
+            </w:r>
+          </w:p>
+        </w:tc>
+        <w:tc>
+          <w:tcPr>
+            <w:tcW w:type="dxa" w:w="4386"/>
+          </w:tcPr>
+          <w:p>
+            <w:r>
+              <w:t>2024-12-31</w:t>
+              <w:br/>
+              <w:t>4.78%</w:t>
+            </w:r>
+          </w:p>
+        </w:tc>
+        <w:tc>
+          <w:tcPr>
+            <w:tcW w:type="dxa" w:w="1949"/>
+          </w:tcPr>
+          <w:p>
+            <w:r>
+              <w:t>ks_a_e_bond_metrics</w:t>
+            </w:r>
+          </w:p>
+        </w:tc>
+      </w:tr>
+      <w:tr>
+        <w:trPr>
+          <w:cantSplit/>
+        </w:trPr>
+        <w:tc>
+          <w:tcPr>
+            <w:tcW w:type="dxa" w:w="3411"/>
+          </w:tcPr>
+          <w:p>
+            <w:r>
+              <w:t>发行人披露利息保障倍数 [ks_a_reported_interest_cover_2025]</w:t>
+            </w:r>
+          </w:p>
+        </w:tc>
+        <w:tc>
+          <w:tcPr>
+            <w:tcW w:type="dxa" w:w="4386"/>
+          </w:tcPr>
+          <w:p>
+            <w:r>
+              <w:t>2025-12-31</w:t>
+              <w:br/>
+              <w:t>‑4.95 倍</w:t>
+            </w:r>
+          </w:p>
+        </w:tc>
+        <w:tc>
+          <w:tcPr>
+            <w:tcW w:type="dxa" w:w="1949"/>
+          </w:tcPr>
+          <w:p>
+            <w:r>
+              <w:t>ks_a_e_bond_metrics</w:t>
+            </w:r>
+          </w:p>
+        </w:tc>
+      </w:tr>
+      <w:tr>
+        <w:trPr>
+          <w:cantSplit/>
+        </w:trPr>
+        <w:tc>
+          <w:tcPr>
+            <w:tcW w:type="dxa" w:w="3411"/>
+          </w:tcPr>
+          <w:p>
+            <w:r>
+              <w:t>发行人披露利息保障倍数 [ks_a_reported_interest_cover_2024]</w:t>
+            </w:r>
+          </w:p>
+        </w:tc>
+        <w:tc>
+          <w:tcPr>
+            <w:tcW w:type="dxa" w:w="4386"/>
+          </w:tcPr>
+          <w:p>
+            <w:r>
+              <w:t>2024-12-31</w:t>
+              <w:br/>
+              <w:t>1.43 倍</w:t>
+            </w:r>
+          </w:p>
+        </w:tc>
+        <w:tc>
+          <w:tcPr>
+            <w:tcW w:type="dxa" w:w="1949"/>
+          </w:tcPr>
+          <w:p>
+            <w:r>
+              <w:t>ks_a_e_bond_metrics</w:t>
+            </w:r>
+          </w:p>
+        </w:tc>
+      </w:tr>
+      <w:tr>
+        <w:trPr>
+          <w:cantSplit/>
+        </w:trPr>
+        <w:tc>
+          <w:tcPr>
+            <w:tcW w:type="dxa" w:w="3411"/>
+          </w:tcPr>
+          <w:p>
+            <w:r>
+              <w:t>发行人披露现金利息保障倍数 [ks_a_reported_cash_interest_cover_2025]</w:t>
+            </w:r>
+          </w:p>
+        </w:tc>
+        <w:tc>
+          <w:tcPr>
+            <w:tcW w:type="dxa" w:w="4386"/>
+          </w:tcPr>
+          <w:p>
+            <w:r>
+              <w:t>2025-12-31</w:t>
+              <w:br/>
+              <w:t>10.73 倍</w:t>
+            </w:r>
+          </w:p>
+        </w:tc>
+        <w:tc>
+          <w:tcPr>
+            <w:tcW w:type="dxa" w:w="1949"/>
+          </w:tcPr>
+          <w:p>
+            <w:r>
+              <w:t>ks_a_e_bond_metrics</w:t>
+            </w:r>
+          </w:p>
+        </w:tc>
+      </w:tr>
+      <w:tr>
+        <w:trPr>
+          <w:cantSplit/>
+        </w:trPr>
+        <w:tc>
+          <w:tcPr>
+            <w:tcW w:type="dxa" w:w="3411"/>
+          </w:tcPr>
+          <w:p>
+            <w:r>
+              <w:t>发行人披露现金利息保障倍数 [ks_a_reported_cash_interest_cover_2024]</w:t>
+            </w:r>
+          </w:p>
+        </w:tc>
+        <w:tc>
+          <w:tcPr>
+            <w:tcW w:type="dxa" w:w="4386"/>
+          </w:tcPr>
+          <w:p>
+            <w:r>
+              <w:t>2024-12-31</w:t>
+              <w:br/>
+              <w:t>7.92 倍</w:t>
+            </w:r>
+          </w:p>
+        </w:tc>
+        <w:tc>
+          <w:tcPr>
+            <w:tcW w:type="dxa" w:w="1949"/>
+          </w:tcPr>
+          <w:p>
+            <w:r>
+              <w:t>ks_a_e_bond_metrics</w:t>
+            </w:r>
+          </w:p>
+        </w:tc>
+      </w:tr>
+      <w:tr>
+        <w:trPr>
+          <w:cantSplit/>
+        </w:trPr>
+        <w:tc>
+          <w:tcPr>
+            <w:tcW w:type="dxa" w:w="3411"/>
+          </w:tcPr>
+          <w:p>
+            <w:r>
+              <w:t>发行人披露EBITDA利息保障倍数 [ks_a_reported_ebitda_interest_cover_2025]</w:t>
+            </w:r>
+          </w:p>
+        </w:tc>
+        <w:tc>
+          <w:tcPr>
+            <w:tcW w:type="dxa" w:w="4386"/>
+          </w:tcPr>
+          <w:p>
+            <w:r>
+              <w:t>2025-12-31</w:t>
+              <w:br/>
+              <w:t>‑2.12 倍</w:t>
+            </w:r>
+          </w:p>
+        </w:tc>
+        <w:tc>
+          <w:tcPr>
+            <w:tcW w:type="dxa" w:w="1949"/>
+          </w:tcPr>
+          <w:p>
+            <w:r>
+              <w:t>ks_a_e_bond_metrics</w:t>
+            </w:r>
+          </w:p>
+        </w:tc>
+      </w:tr>
+      <w:tr>
+        <w:trPr>
+          <w:cantSplit/>
+        </w:trPr>
+        <w:tc>
+          <w:tcPr>
+            <w:tcW w:type="dxa" w:w="3411"/>
+          </w:tcPr>
+          <w:p>
+            <w:r>
+              <w:t>发行人披露EBITDA利息保障倍数 [ks_a_reported_ebitda_interest_cover_2024]</w:t>
+            </w:r>
+          </w:p>
+        </w:tc>
+        <w:tc>
+          <w:tcPr>
+            <w:tcW w:type="dxa" w:w="4386"/>
+          </w:tcPr>
+          <w:p>
+            <w:r>
+              <w:t>2024-12-31</w:t>
+              <w:br/>
+              <w:t>4.00 倍</w:t>
+            </w:r>
+          </w:p>
+        </w:tc>
+        <w:tc>
+          <w:tcPr>
+            <w:tcW w:type="dxa" w:w="1949"/>
+          </w:tcPr>
+          <w:p>
+            <w:r>
+              <w:t>ks_a_e_bond_metrics</w:t>
+            </w:r>
+          </w:p>
+        </w:tc>
+      </w:tr>
+      <w:tr>
+        <w:trPr>
+          <w:cantSplit/>
+        </w:trPr>
+        <w:tc>
+          <w:tcPr>
+            <w:tcW w:type="dxa" w:w="3411"/>
+          </w:tcPr>
+          <w:p>
+            <w:r>
+              <w:t>发行人披露贷款偿还率 [ks_a_reported_loan_repayment_rate_2025]</w:t>
+            </w:r>
+          </w:p>
+        </w:tc>
+        <w:tc>
+          <w:tcPr>
+            <w:tcW w:type="dxa" w:w="4386"/>
+          </w:tcPr>
+          <w:p>
+            <w:r>
+              <w:t>2025-12-31</w:t>
+              <w:br/>
+              <w:t>100.00%</w:t>
+            </w:r>
+          </w:p>
+        </w:tc>
+        <w:tc>
+          <w:tcPr>
+            <w:tcW w:type="dxa" w:w="1949"/>
+          </w:tcPr>
+          <w:p>
+            <w:r>
+              <w:t>ks_a_e_bond_metrics</w:t>
+            </w:r>
+          </w:p>
+        </w:tc>
+      </w:tr>
+      <w:tr>
+        <w:trPr>
+          <w:cantSplit/>
+        </w:trPr>
+        <w:tc>
+          <w:tcPr>
+            <w:tcW w:type="dxa" w:w="3411"/>
+          </w:tcPr>
+          <w:p>
+            <w:r>
+              <w:t>发行人披露贷款偿还率 [ks_a_reported_loan_repayment_rate_2024]</w:t>
+            </w:r>
+          </w:p>
+        </w:tc>
+        <w:tc>
+          <w:tcPr>
+            <w:tcW w:type="dxa" w:w="4386"/>
+          </w:tcPr>
+          <w:p>
+            <w:r>
+              <w:t>2024-12-31</w:t>
+              <w:br/>
+              <w:t>100.00%</w:t>
+            </w:r>
+          </w:p>
+        </w:tc>
+        <w:tc>
+          <w:tcPr>
+            <w:tcW w:type="dxa" w:w="1949"/>
+          </w:tcPr>
+          <w:p>
+            <w:r>
+              <w:t>ks_a_e_bond_metrics</w:t>
+            </w:r>
+          </w:p>
+        </w:tc>
+      </w:tr>
+      <w:tr>
+        <w:trPr>
+          <w:cantSplit/>
+        </w:trPr>
+        <w:tc>
+          <w:tcPr>
+            <w:tcW w:type="dxa" w:w="3411"/>
+          </w:tcPr>
+          <w:p>
+            <w:r>
+              <w:t>发行人披露利息偿付率 [ks_a_reported_interest_payment_rate_2025]</w:t>
+            </w:r>
+          </w:p>
+        </w:tc>
+        <w:tc>
+          <w:tcPr>
+            <w:tcW w:type="dxa" w:w="4386"/>
+          </w:tcPr>
+          <w:p>
+            <w:r>
+              <w:t>2025-12-31</w:t>
+              <w:br/>
+              <w:t>100.00%</w:t>
+            </w:r>
+          </w:p>
+        </w:tc>
+        <w:tc>
+          <w:tcPr>
+            <w:tcW w:type="dxa" w:w="1949"/>
+          </w:tcPr>
+          <w:p>
+            <w:r>
+              <w:t>ks_a_e_bond_metrics</w:t>
+            </w:r>
+          </w:p>
+        </w:tc>
+      </w:tr>
+      <w:tr>
+        <w:trPr>
+          <w:cantSplit/>
+        </w:trPr>
+        <w:tc>
+          <w:tcPr>
+            <w:tcW w:type="dxa" w:w="3411"/>
+          </w:tcPr>
+          <w:p>
+            <w:r>
+              <w:t>发行人披露利息偿付率 [ks_a_reported_interest_payment_rate_2024]</w:t>
+            </w:r>
+          </w:p>
+        </w:tc>
+        <w:tc>
+          <w:tcPr>
+            <w:tcW w:type="dxa" w:w="4386"/>
+          </w:tcPr>
+          <w:p>
+            <w:r>
+              <w:t>2024-12-31</w:t>
+              <w:br/>
+              <w:t>100.00%</w:t>
+            </w:r>
+          </w:p>
+        </w:tc>
+        <w:tc>
+          <w:tcPr>
+            <w:tcW w:type="dxa" w:w="1949"/>
+          </w:tcPr>
+          <w:p>
+            <w:r>
+              <w:t>ks_a_e_bond_metrics</w:t>
+            </w:r>
+          </w:p>
+        </w:tc>
+      </w:tr>
+      <w:tr>
+        <w:trPr>
+          <w:cantSplit/>
+        </w:trPr>
+        <w:tc>
+          <w:tcPr>
+            <w:tcW w:type="dxa" w:w="3411"/>
+          </w:tcPr>
+          <w:p>
+            <w:r>
+              <w:t>发行人披露归母亏损占2025年末净资产比例 [ks_a_reported_loss_equity_2025]</w:t>
+            </w:r>
+          </w:p>
+        </w:tc>
+        <w:tc>
+          <w:tcPr>
+            <w:tcW w:type="dxa" w:w="4386"/>
+          </w:tcPr>
+          <w:p>
+            <w:r>
+              <w:t>2025-12-31</w:t>
+              <w:br/>
+              <w:t>13.49%</w:t>
+            </w:r>
+          </w:p>
+        </w:tc>
+        <w:tc>
+          <w:tcPr>
+            <w:tcW w:type="dxa" w:w="1949"/>
+          </w:tcPr>
+          <w:p>
+            <w:r>
+              <w:t>ks_a_e_bond_repayment_claim</w:t>
+            </w:r>
+          </w:p>
+        </w:tc>
+      </w:tr>
+      <w:tr>
+        <w:trPr>
+          <w:cantSplit/>
+        </w:trPr>
+        <w:tc>
+          <w:tcPr>
+            <w:tcW w:type="dxa" w:w="3411"/>
+          </w:tcPr>
+          <w:p>
+            <w:r>
+              <w:t>本期归母亏损金额/期末归母权益 [ks_a_loss_closing_parent_comparison]</w:t>
+            </w:r>
+          </w:p>
+        </w:tc>
+        <w:tc>
+          <w:tcPr>
+            <w:tcW w:type="dxa" w:w="4386"/>
+          </w:tcPr>
+          <w:p>
+            <w:r>
+              <w:t>2025-12-31</w:t>
+              <w:br/>
+              <w:t>13.49%</w:t>
+            </w:r>
+          </w:p>
+        </w:tc>
+        <w:tc>
+          <w:tcPr>
+            <w:tcW w:type="dxa" w:w="1949"/>
+          </w:tcPr>
+          <w:p>
+            <w:r>
+              <w:t>ks_a_e_bs, ks_a_e_is</w:t>
+            </w:r>
+          </w:p>
+        </w:tc>
+      </w:tr>
+      <w:tr>
+        <w:trPr>
+          <w:cantSplit/>
+        </w:trPr>
+        <w:tc>
+          <w:tcPr>
+            <w:tcW w:type="dxa" w:w="3411"/>
+          </w:tcPr>
+          <w:p>
+            <w:r>
+              <w:t>本期归母亏损金额/期末总权益 [ks_a_loss_closing_total_comparison]</w:t>
+            </w:r>
+          </w:p>
+        </w:tc>
+        <w:tc>
+          <w:tcPr>
+            <w:tcW w:type="dxa" w:w="4386"/>
+          </w:tcPr>
+          <w:p>
+            <w:r>
+              <w:t>2025-12-31</w:t>
+              <w:br/>
+              <w:t>13.21%</w:t>
+            </w:r>
+          </w:p>
+        </w:tc>
+        <w:tc>
+          <w:tcPr>
+            <w:tcW w:type="dxa" w:w="1949"/>
+          </w:tcPr>
+          <w:p>
+            <w:r>
+              <w:t>ks_a_e_bs, ks_a_e_is</w:t>
+            </w:r>
+          </w:p>
+        </w:tc>
+      </w:tr>
+      <w:tr>
+        <w:trPr>
+          <w:cantSplit/>
+        </w:trPr>
+        <w:tc>
+          <w:tcPr>
+            <w:tcW w:type="dxa" w:w="3411"/>
+          </w:tcPr>
+          <w:p>
+            <w:r>
+              <w:t>本期归母亏损金额/期初归母权益 [ks_a_loss_opening_parent_comparison]</w:t>
+            </w:r>
+          </w:p>
+        </w:tc>
+        <w:tc>
+          <w:tcPr>
+            <w:tcW w:type="dxa" w:w="4386"/>
+          </w:tcPr>
+          <w:p>
+            <w:r>
+              <w:t>2025-12-31</w:t>
+              <w:br/>
+              <w:t>10.74%</w:t>
+            </w:r>
+          </w:p>
+        </w:tc>
+        <w:tc>
+          <w:tcPr>
+            <w:tcW w:type="dxa" w:w="1949"/>
+          </w:tcPr>
+          <w:p>
+            <w:r>
+              <w:t>ks_a_e_bs, ks_a_e_is</w:t>
+            </w:r>
+          </w:p>
+        </w:tc>
+      </w:tr>
+      <w:tr>
+        <w:trPr>
+          <w:cantSplit/>
+        </w:trPr>
+        <w:tc>
+          <w:tcPr>
+            <w:tcW w:type="dxa" w:w="3411"/>
+          </w:tcPr>
+          <w:p>
+            <w:r>
+              <w:t>本期归母亏损金额/期初总权益 [ks_a_loss_opening_total_comparison]</w:t>
+            </w:r>
+          </w:p>
+        </w:tc>
+        <w:tc>
+          <w:tcPr>
+            <w:tcW w:type="dxa" w:w="4386"/>
+          </w:tcPr>
+          <w:p>
+            <w:r>
+              <w:t>2025-12-31</w:t>
+              <w:br/>
+              <w:t>10.57%</w:t>
+            </w:r>
+          </w:p>
+        </w:tc>
+        <w:tc>
+          <w:tcPr>
+            <w:tcW w:type="dxa" w:w="1949"/>
+          </w:tcPr>
+          <w:p>
+            <w:r>
+              <w:t>ks_a_e_bs, ks_a_e_is</w:t>
+            </w:r>
+          </w:p>
+        </w:tc>
+      </w:tr>
     </w:tbl>
     <w:p/>
     <w:p>
@@ -2993,7 +3844,7 @@
     </w:p>
     <w:p>
       <w:r>
-        <w:t>按同一法人、银行及产品对应总额、已用、未用、共享或循环额度，核抵质押、保证金、财务约束、提款前提、撤销权和有效期，再将真正可用金额匹配付款日。综合授信可能包含票据、保函或其他产品，年报借款额度也可能有不同总体；这些是候选解释，不是已查明原因。现有再融资研究分5.0/4.5及加权4.65仅保留为原条件分支，金额冲突未关闭前不能证明这一赋值或BBB+资金前提充分，也不因缺资料任意另给分。</w:t>
+        <w:t>按同一法人、银行及产品对应总额、已用、未用、共享或循环额度，核抵质押、保证金、财务约束、提款前提、撤销权和有效期，再将真正可用金额匹配付款日。综合授信可能包含票据、保函或其他产品，年报借款额度也可能有不同总体；这些是候选解释，不是已查明原因。现有再融资研究分5.0/4.5及加权4.65仅保留为原条件分支，金额冲突未关闭前不能证明这一赋值或BBB+资金前提充分，也不因缺资料任意另给分。 年报第95页管理层称授信充足、可快速融资且自有资金及融资足以偿付；这与已披露季度融资形成支持线索，但未解决两个额度总体及合同可提用条件的差异。</w:t>
       </w:r>
     </w:p>
     <w:p>
@@ -3003,7 +3854,7 @@
     </w:p>
     <w:p>
       <w:r>
-        <w:t>反证：ks_a_e_q1</w:t>
+        <w:t>反证：ks_a_e_q1, ks_a_e_bond_repayment_claim</w:t>
       </w:r>
     </w:p>
     <w:p>
@@ -3090,6 +3941,44 @@
     <w:p>
       <w:r>
         <w:t>判断改变条件：拿到账面至合同本金的逐笔调节、债权人和到期日，并确认背书追索及供应商融资性质后重算债务、短债覆盖和融资缺口。</w:t>
+      </w:r>
+    </w:p>
+    <w:p>
+      <w:pPr>
+        <w:pStyle w:val="Heading2"/>
+      </w:pPr>
+      <w:r>
+        <w:t>发行人偿债指标与研究定义分列 [ks_a_find_reported_debt_metrics; supported]</w:t>
+      </w:r>
+    </w:p>
+    <w:p>
+      <w:r>
+        <w:t>发行人2025/2024 EBITDA全部债务比分别为‑2.53%、4.78%，EBITDA利息保障分别为‑2.12 倍、4.00 倍。研究2025 EBITDA/广义利息债为‑4.00%，EBITDA/全部利息为‑1.66 倍；差异需先核定义，不能据指标名称互相替换。</w:t>
+      </w:r>
+    </w:p>
+    <w:p>
+      <w:r>
+        <w:t>用既有金额计算，2025/2024 EBITDA/总负债为‑2.53%、4.78%，EBITDA/费用化利息为‑2.12 倍、4.00 倍，EBIT/费用化利息为‑4.95 倍、1.43 倍，舍入后分别与发行人对应指标一致。这是候选分母的一致性解释，不是公司公式已获确认。现金利息保障10.73 倍及两年偿还/付息率原值保留，未用合计利息现金、分红现金或某一应计利息拼出相同结果。负盈利与报告期偿付完成可以并存，历史偿付率不证明未来付款资金充足。 同页亏损比例原文13.49%与本期亏损/期末归母权益13.49%舍入一致；期末总权益对照为13.21%，标题上年末口径的归母/总权益对照为10.74%、10.57%。两种期初口径均超过标题10%门槛，但不能用期末比例冒充期初比例；原文期间和权益范围说明仍需澄清，不据此认定亏损金额错误。</w:t>
+      </w:r>
+    </w:p>
+    <w:p>
+      <w:r>
+        <w:t>证据：ks_a_e_bond_metrics, ks_a_e_external_rating_2025, ks_a_ebitda_liab_comparison_2024, ks_a_ebitda_debt_comparison_2024, ks_a_ebitda_expinterest_comparison_2024, ks_a_ebit_expinterest_comparison_2024, ks_a_ebitda_liab_comparison_2025, ks_a_ebitda_debt_comparison_2025, ks_a_ebitda_expinterest_comparison_2025, ks_a_ebit_expinterest_comparison_2025, ks_a_ebitda_interest_2025, ks_a_ebitda_interest_2024, ks_a_e_bond_repayment_claim, ks_a_loss_closing_parent_comparison, ks_a_loss_closing_total_comparison, ks_a_loss_opening_parent_comparison, ks_a_loss_opening_total_comparison</w:t>
+      </w:r>
+    </w:p>
+    <w:p>
+      <w:r>
+        <w:t>反证：尚无足以排除其他解释的额外证据</w:t>
+      </w:r>
+    </w:p>
+    <w:p>
+      <w:r>
+        <w:t>其他解释：公司指标可能采用总负债或不同利息定义，亦可能有未列调节；相同舍入结果不足以在这些解释中唯一择一。；年报另引述的2025年外部AA/稳定与本次条件研究建议分开；不以该外部等级消除当前资金、历史口径及持续承诺限制。</w:t>
+      </w:r>
+    </w:p>
+    <w:p>
+      <w:r>
+        <w:t>判断改变条件：取得公司指标计算表、全部债务/利息组成及贷款偿付总体后，逐项桥接至研究口径并解释差异；若涉及实际债务漏项、资金受限或逾期，再更新对应因素和付款情景。仅完成舍入对照不变更既有条件等级。</w:t>
       </w:r>
     </w:p>
     <w:p>
@@ -5711,12 +6600,12 @@
     </w:p>
     <w:p>
       <w:r>
-        <w:t>需求较弱→放慢投资可减少近期资本支出，却可能使新产能经营回款晚于债项支付；建设计划恢复→先需资金及营运周转→需将暂时补流从一般经营资金中恢复用途→先查母公司可调度现金。尚未投入额度、临时补流恢复用途与债券本金不是三笔可相加的外部债务。源表38.82%包括永久补流，不能证明项目已接近四成完工。</w:t>
-      </w:r>
-    </w:p>
-    <w:p>
-      <w:r>
-        <w:t>证据：ks_project_e_progress, ks_project_e_schedule, ks_project_e_tracking, ks_d_e_fund_new, ks_d_e_issue_coupon, ks_d_e_maturity_call</w:t>
+        <w:t>需求较弱→放慢投资可减少近期资本支出，却可能使新产能经营回款晚于债项支付；建设计划恢复→先需资金及营运周转→需将暂时补流从一般经营资金中恢复用途→先查母公司可调度现金。尚未投入额度、临时补流恢复用途与债券本金不是三笔可相加的外部债务。源表38.82%包括永久补流，不能证明项目已接近四成完工。 年报第95页称募投实施已提升盈利、稳定经营现金及自有资金和融资可支付回售/赎回/到期本息；与上述实际投入、延期和资金恢复条件对照，该主张尚不能替代按法人及付款日验证的偿债来源，投入比例也不能作为项目利润或完工率的反证。 第83页四项建设/升级项目当期及累计效益均明列零，是对项目贡献的直接披露；补流项目及全部资金用途的影响范围不同，不能据此认定上述总体主张虚假，但新增项目盈利尚未由该表支持。需说明具体收益、时点及法人并与现金预算衔接。</w:t>
+      </w:r>
+    </w:p>
+    <w:p>
+      <w:r>
+        <w:t>证据：ks_project_e_progress, ks_project_e_schedule, ks_project_e_tracking, ks_d_e_fund_new, ks_d_e_issue_coupon, ks_d_e_maturity_call, ks_a_e_bond_repayment_claim, ks_a_e_project_reported_benefits, ks_a_e_audit</w:t>
       </w:r>
     </w:p>
     <w:p>
@@ -19919,32 +20808,32 @@
         <w:pStyle w:val="Heading2"/>
       </w:pPr>
       <w:r>
-        <w:t>ks_a_proc_cfo 公开原件核验与计算重现</w:t>
-      </w:r>
-    </w:p>
-    <w:p>
-      <w:r>
-        <w:t>状态 performed；认定 准确性、列报、范围与截止；总体 已登记公开PDF及指定页面；选取 对本发现相关主表、附注及异常表格定向核读。</w:t>
-      </w:r>
-    </w:p>
-    <w:p>
-      <w:r>
-        <w:t>抄录四表及现金补充资料的原符号和列期</w:t>
-      </w:r>
-    </w:p>
-    <w:p>
-      <w:r>
-        <w:t>使用既有calculate.evaluate重算加总、净额与滚动</w:t>
-      </w:r>
-    </w:p>
-    <w:p>
-      <w:r>
-        <w:t>保留原始输入和计算结果，未将未闭合项目调平</w:t>
-      </w:r>
-    </w:p>
-    <w:p>
-      <w:r>
-        <w:t>实际结果：本次全部底稿勾稽的状态与残差见同源结果；现金、利润归属和权益及主要附注的已列算式已复算。应收准备符号与滁州在建两项原披露差异保留，不宣称所有附注均闭合。；证据 ks_a_e_bs, ks_a_e_is, ks_a_e_cf, ks_a_e_equity, ks_a_e_indirect。</w:t>
+        <w:t>ks_a_proc_cfo 重算公开直接法及间接法经营现金、现金期初期末桥和投入/分配后现金余量</w:t>
+      </w:r>
+    </w:p>
+    <w:p>
+      <w:r>
+        <w:t>状态 performed；认定 准确性、列报、范围与截止；总体 2025年报第111—113页现金流量表及第208—209页补充资料的2025/2024两列；相关资本开支、分红及现金余额原值；选取 两列现金流表和间接调节的已列项目全部算术重算，未取得交易明细总体或执行交易抽样。</w:t>
+      </w:r>
+    </w:p>
+    <w:p>
+      <w:r>
+        <w:t>按原符号重算经营流入/流出小计、直接法CFO，并以净利润加减已披露调整重算间接法CFO，两列分别与报表CFO比较。</w:t>
+      </w:r>
+    </w:p>
+    <w:p>
+      <w:r>
+        <w:t>分别重算经营、投资、筹资净额加汇率的现金变动，以及期初现金等价物至期末桥；不将货币资金全部当作现金等价物。</w:t>
+      </w:r>
+    </w:p>
+    <w:p>
+      <w:r>
+        <w:t>依既有明示公式复算CFO扣现金资本开支及已分红后的余量；仅验证披露与算式的一致性，保留与本程序范围不同的附注差额和未获明细。</w:t>
+      </w:r>
+    </w:p>
+    <w:p>
+      <w:r>
+        <w:t>实际结果：2025直接法 ks_a_recalc_cfo_2025 与间接法 ks_a_indirect_cfo_2025 均为3.20 亿元人民币；2024对应两算式均为3.15 亿元人民币，勾稽 ks_a_r_cfo_2025/2024 及 ks_a_r_indirect_cfo_2025/2024 残差为零。现金三类活动加汇率及期初期末桥分别见 ks_a_recalc_cashdelta_2025/2024、ks_a_cashbridge_2025/2024，对应 ks_a_r_cashdelta_2025/2024 和 ks_a_r_cash_2025/2024 残差为零。投入及分配后余量见 ks_a_fcf_2025、ks_a_fcf_after_div；这些复算不证明收付款真实性、持续经营口径或资金可达性。另列的 ks_a_r_arres、ks_a_r_chuzhou 及 ks_tax_r_candidate 差额仍未决，不属于本项现金加总已闭合的证明范围。；证据 ks_a_e_cf, ks_a_e_indirect, ks_a_e_equity, ks_a_recalc_opcashin_2025, ks_a_recalc_opcashout_2025, ks_a_recalc_cfo_2025, ks_a_indirect_cfo_2025, ks_a_recalc_opcashin_2024, ks_a_recalc_opcashout_2024, ks_a_recalc_cfo_2024, ks_a_indirect_cfo_2024, ks_a_recalc_cashdelta_2025, ks_a_recalc_cashdelta_2024, ks_a_cashbridge_2025, ks_a_cashbridge_2024, ks_a_fcf_2025, ks_a_fcf_after_div, ks_a_ar_res_roll, ks_a_chuzhou_roll, ks_tax_candidate_residual。</w:t>
       </w:r>
     </w:p>
     <w:p>
@@ -20074,22 +20963,42 @@
         <w:pStyle w:val="Heading2"/>
       </w:pPr>
       <w:r>
-        <w:t>ks_a_pending_ar 底层事实进一步核验</w:t>
-      </w:r>
-    </w:p>
-    <w:p>
-      <w:r>
-        <w:t>状态 awaiting_data；认定 存在性、完整性、计价、权利义务；总体 对应底层余额、合同、交易和期后事项；选取 尚未取得总体，不预称已抽样。</w:t>
-      </w:r>
-    </w:p>
-    <w:p>
-      <w:r>
-        <w:t>客户逐笔期后银行收现、账龄及重组台账，单项和组合ECL参数、抵债估值及担保可执行证据。</w:t>
-      </w:r>
-    </w:p>
-    <w:p>
-      <w:r>
-        <w:t>实际结果：未实施；公开资料不足以替代函证、凭证、合同或现场验证。；证据 。</w:t>
+        <w:t>ks_a_pending_ar 验证期末债权的可回收金额和现金时间，区分真实回款、非现金处置及融资支持收现</w:t>
+      </w:r>
+    </w:p>
+    <w:p>
+      <w:r>
+        <w:t>状态 awaiting_data；认定 计价和分摊、存在性及权利、截止；总体 尚未取得：期末按客户、合同和发票的债权余额及准备明细、原始账龄、期后收付款、重组/抵债和经销担保贷款完整台账；取得后先与已披露原值、准备和核销滚动核对总体；选取 总体取得后优先覆盖单项计提、长账龄、大额风险客户、抵债重组和年末保证支持回款；再覆盖其余主要组合。按实际集中度和差错风险确定项目，不预称样本数量或已实施抽样。</w:t>
+      </w:r>
+    </w:p>
+    <w:p>
+      <w:r>
+        <w:t>将期末余额追至合同、交付/验收及结算权利，重建原始到期日和账龄；将银行收款逐笔追至该期末发票/债权，核付款人、付款日期及冲销分录，剔开新订单预收、集团内划转和与旧债无关的资金。</w:t>
+      </w:r>
+    </w:p>
+    <w:p>
+      <w:r>
+        <w:t>对年末经销贷款支持收现，联查银行放款、本公司收款、保证及期后还贷/退款，辨别由融资支持但真实结清的旧债与资金循环；不能仅凭保证余额从CFO扣减。</w:t>
+      </w:r>
+    </w:p>
+    <w:p>
+      <w:r>
+        <w:t>将非现金重组、抵债和核销逐笔接至原债权、协议及执行事实，核资产权属、可变现净额、税费和预计回收日期，避免将抵债入账额当作现金回款；对准备其他变动保留原负号并核其语义及总账。</w:t>
+      </w:r>
+    </w:p>
+    <w:p>
+      <w:r>
+        <w:t>用核实的期后收现和重组执行检验单项/组合ECL中的违约、回收率及时间假设；差异先区分披露符号、范围、真实漏损或现金延期，形成可复算的准备及回收时间修订。</w:t>
+      </w:r>
+    </w:p>
+    <w:p>
+      <w:r>
+        <w:t>将经证实的损失或可用资金变化分别接到资产质量/权益与逐月收现情景；同一损失不在准备、评级调整和现金重复扣减，资料不足部分保持未知，不预定下调幅度。</w:t>
+      </w:r>
+    </w:p>
+    <w:p>
+      <w:r>
+        <w:t>实际结果：未实施底层核验；现有公开账龄、准备和经营应收调整已列示，不能据此证明每笔债权真实可收回或确定实际收款时间。；证据 ks_a_e_ar, ks_a_e_contract, ks_a_ar_res_roll, ks_credit_e_dealer_use, ks_credit_e_yearend_settlement。</w:t>
       </w:r>
     </w:p>
     <w:p>
@@ -20212,22 +21121,37 @@
         <w:pStyle w:val="Heading2"/>
       </w:pPr>
       <w:r>
-        <w:t>ks_a_pending_cip 底层事实进一步核验</w:t>
-      </w:r>
-    </w:p>
-    <w:p>
-      <w:r>
-        <w:t>状态 awaiting_data；认定 存在性、完整性、计价、权利义务；总体 对应底层余额、合同、交易和期后事项；选取 尚未取得总体，不预称已抽样。</w:t>
-      </w:r>
-    </w:p>
-    <w:p>
-      <w:r>
-        <w:t>滁州一期重要在建表各列至总账明细的完整桥、其他减少内容、转固验收及资本化利息计算。</w:t>
-      </w:r>
-    </w:p>
-    <w:p>
-      <w:r>
-        <w:t>实际结果：未实施；公开资料不足以替代函证、凭证、合同或现场验证。；证据 。</w:t>
+        <w:t>ks_a_pending_cip 定位滁州一期在建滚动差额并判断是否影响资产、当期损益、资本化和后续资金需求</w:t>
+      </w:r>
+    </w:p>
+    <w:p>
+      <w:r>
+        <w:t>状态 awaiting_data；认定 完整性及准确性、计价和分摊、分类及截止；总体 尚未取得：滁州一期期初项目明细、全年增加/转固/其他减少及期末余额至总账的完整记录、验收资料、减值和资本化利息底稿；选取 先针对原表其他减少与期末余额的全部差异定位；总体取得后选取影响资本化、转固时点及减值的主要/异常项目，不预设未获资料的样本数量。</w:t>
+      </w:r>
+    </w:p>
+    <w:p>
+      <w:r>
+        <w:t>将第185页各列逐项接至项目辅助账及总账，分别重建期初、增加、转固、其他减少、期末；把其他减少逐笔追至对应科目和凭证，查清是否重分类、处置、减值、重复列示或范围变化。</w:t>
+      </w:r>
+    </w:p>
+    <w:p>
+      <w:r>
+        <w:t>将工程支出和减少分别追至合同、工程量确认、验收及付款或非现金记录；空白转固栏仍待核，不当作已证明无转固，亦不为使表格闭合而改动原披露值。</w:t>
+      </w:r>
+    </w:p>
+    <w:p>
+      <w:r>
+        <w:t>按实际达到预定可使用状态的日期核转固、折旧及借款费用停止资本化；结合延期、闲置及项目现金流资料评价减值，并区分资本化应计支出和实际现金付款。</w:t>
+      </w:r>
+    </w:p>
+    <w:p>
+      <w:r>
+        <w:t>若仅为披露表列重复/范围错误，记录正确列报桥而不机械扣利润；若确认资产计量或期间错误，量化资产、损益和权益影响。将实付资本支出及剩余合同支付接到项目资金预算，避免与临时补流恢复用途重复计债。</w:t>
+      </w:r>
+    </w:p>
+    <w:p>
+      <w:r>
+        <w:t>实际结果：未实施明细账及验收核验；公开原表差额仍未解释，不能将其认定为应扣减利润或新增债务。；证据 ks_a_e_fixed, ks_a_chuzhou_roll, ks_a_chuzhou_end, ks_project_e_progress, ks_project_e_schedule。</w:t>
       </w:r>
     </w:p>
     <w:p>
@@ -20235,22 +21159,42 @@
         <w:pStyle w:val="Heading2"/>
       </w:pPr>
       <w:r>
-        <w:t>ks_a_pending_tax 底层事实进一步核验</w:t>
-      </w:r>
-    </w:p>
-    <w:p>
-      <w:r>
-        <w:t>状态 awaiting_data；认定 存在性、完整性、计价、权利义务；总体 对应底层余额、合同、交易和期后事项；选取 尚未取得总体，不预称已抽样。</w:t>
-      </w:r>
-    </w:p>
-    <w:p>
-      <w:r>
-        <w:t>按纳税主体未来应税利润预算、亏损到期表、可抵扣差异转回时点及优惠资格持续性。</w:t>
-      </w:r>
-    </w:p>
-    <w:p>
-      <w:r>
-        <w:t>实际结果：未实施；公开资料不足以替代函证、凭证、合同或现场验证。；证据 。</w:t>
+        <w:t>ks_a_pending_tax 检验重大DTA可利用性，并厘清递延税余额、损益、权益和现金的归属</w:t>
+      </w:r>
+    </w:p>
+    <w:p>
+      <w:r>
+        <w:t>状态 awaiting_data；认定 计价和分摊、准确性、列报及期间归属；总体 尚未取得：按纳税主体、税区和到期年度的已确认/未确认亏损及暂时性差异明细、申报税基、转回表、税率与优惠资格、应税利润预算及递延税分录；选取 优先覆盖减值和已确认亏损DTA、期限临近或持续亏损主体，以及可转债权益相关DTL与现金流税调整差异；其余重大差异按总体和期限风险确定，不把未确认亏损到期表替代已确认总体。</w:t>
+      </w:r>
+    </w:p>
+    <w:p>
+      <w:r>
+        <w:t>按同一纳税主体及税区将期初/期末DTA和DTL接至税基及暂时性差异，拆出本期损益、权益、转股、合并范围及其他变动；核现金流补充资料税调整和其他项的实际分录，不将可转债期末DTL余额直接当本期权益流量。</w:t>
+      </w:r>
+    </w:p>
+    <w:p>
+      <w:r>
+        <w:t>将亏损发生及到期年度、差异预计转回、税率/优惠和抵扣限制追至申报与适用依据，区分已确认和未确认部分；不能以集团其他主体盈利或未证实税收合并抵扣补足本主体。</w:t>
+      </w:r>
+    </w:p>
+    <w:p>
+      <w:r>
+        <w:t>将各主体未来应税利润预算接到订单、经营预测、历史预算兑现及可用应税暂时性差异转回；按同一可抵扣期间逐项分配，防止一份未来应税利润重复支持亏损、减值等多个DTA。</w:t>
+      </w:r>
+    </w:p>
+    <w:p>
+      <w:r>
+        <w:t>对到期前利润不足、转回时点错配或优惠失效形成金额与时间敏感性，辨别确认、计量和归属差异；经证实减记时按其真实税务后果更新损益/权益，不再叠加同一假设税盾。</w:t>
+      </w:r>
+    </w:p>
+    <w:p>
+      <w:r>
+        <w:t>将实际可用抵扣及税款支付安排接到现金税预算；DTA余额和递延税收益不作可调度现金。以修订后的资本缓冲及现金时点评价评级因素，候选税桥小额残差本身不触发等级调整。</w:t>
+      </w:r>
+    </w:p>
+    <w:p>
+      <w:r>
+        <w:t>实际结果：未实施纳税主体税基和盈利预算核验；公开余额、损益及候选权益桥可复算，但尚未证明全部DTA可实现或候选税流归属已闭合。；证据 ks_a_e_tax, ks_tax_e_balance, ks_tax_e_pl_cash, ks_tax_e_cas18, ks_tax_candidate_residual, ks_tax_cf_pl_gap。</w:t>
       </w:r>
     </w:p>
     <w:p>
@@ -21467,7 +22411,7 @@
     </w:p>
     <w:p>
       <w:r>
-        <w:t>[ks_a_e_coverage] ks_a_s_25 PDF页码与印刷页码一致。文本实际覆盖第1—92、97—245页；不使用第93—96页。选定表格46页提取矩阵；视觉读第114、119、125、128、185、208、209、210页；其余为文本及矩阵核读。2024补充只读第10、116—124、127—130、164、184、191、192、194、195、203、208—210页，未声称阅读全文。2026Q1全部12页文本已读。内控审计4页、自评11页、政策变更2页全部文本已读；募集资金鉴证11页，其中第10、11页为扫描图视觉阅读。 追加独立视觉复读2025第168页、2024第210页；补流归还及续作公告全部2页和6页已读。 2024年报第126、131—134页后续补读，含原2023合并权益变动表。 覆盖记录，阅读范围可由抽取文件及实际源页追溯；非审计保证</w:t>
+        <w:t>[ks_a_e_coverage] ks_a_s_25 PDF页码与印刷页码一致。文本实际覆盖第1—245页；第93—96页债券发行、存续变动、偿债安排及指标已补读，第83页项目效益及第95—96页指标另经图像核对。第95页外部评级仅记录机构历史结论，不作为本研究因素得分或等级校准目标。选定表格46页提取矩阵；视觉读第114、119、125、128、185、208、209、210页；其余为文本及矩阵核读。2024补充只读第10、116—124、127—130、164、184、191、192、194、195、203、208—210页，未声称阅读全文。2026Q1全部12页文本已读。内控审计4页、自评11页、政策变更2页全部文本已读；募集资金鉴证11页，其中第10、11页为扫描图视觉阅读。 追加独立视觉复读2025第168页、2024第210页；补流归还及续作公告全部2页和6页已读。 2024年报第126、131—134页后续补读，含原2023合并权益变动表。 覆盖记录，阅读范围可由抽取文件及实际源页追溯；非审计保证</w:t>
       </w:r>
     </w:p>
     <w:p>
@@ -21507,7 +22451,7 @@
     </w:p>
     <w:p>
       <w:r>
-        <w:t>[ks_a_e_audit] ks_a_s_25 第97—101页，审计报告。致同出具无保留意见；收入确认，以及应收账款、合同资产和其他非流动资产中的合同资产减值这两项关键审计事项的审计程序由审计师实施，不作为本分析已实施程序。审计意见不保证无任何错报或未来偿债。 发行人正式披露；财务报表经审计，但本分析未复做审计程序</w:t>
+        <w:t>[ks_a_e_audit] ks_a_s_25 第97—101页，审计报告。致同出具无保留意见；收入确认，以及应收账款、合同资产和其他非流动资产中的合同资产减值这两项关键审计事项的审计程序由审计师实施，不作为本分析已实施程序。审计意见不保证无任何错报或未来偿债。 第100页明确财报审计意见不涵盖年报其他信息，亦不对其发表鉴证结论；审计师称就其他信息无事项需报告，不等于对第95页未来偿债安排作出保证。 发行人正式披露；财务报表经审计，但本分析未复做审计程序</w:t>
       </w:r>
     </w:p>
     <w:p>
@@ -22398,6 +23342,26 @@
     <w:p>
       <w:r>
         <w:t>[ks_econ_e_cash_tax] ks_a_s_25 PDF193企业所得税应付；203利息及其他收益；205–206当期/递延所得税与其他经营收现分项。2025合并亏损仍有当期所得税58,386,629.64；所得税期末应付14,216,594.91；其他经营收现含利息、补助及手续费与保证金/受限资金/员工还款等不同性质。 公开经审计年报；未来支付和收益确认按明示条件，不证明未来可收回或可抵扣。</w:t>
+      </w:r>
+    </w:p>
+    <w:p>
+      <w:r>
+        <w:t>[ks_a_e_bond_metrics] ks_a_s_25 第95—96页，第七节第八项，近两年主要会计数据和财务指标，含跨页续表。发行人列示2025/2024的流动比率、资产负债率、速动比率、EBITDA全部债务比、利息保障倍数、现金利息保障倍数、EBITDA利息保障倍数、贷款偿还率和利息偿付率，原值单列。扣非净利润以万元保留两位小数，与本底稿原元值舍入一致；续表表头仍写期末/上年末，但利息及偿付率为年度指标。该段未给出全部债务、利息及现金保障的具体公式或偿付率总体，不能按名称直接等同研究指标。 发行人正式年报披露；按原表记录，不等于本研究独立验证全部指标定义或逐笔履约；本节属于年报其他信息，财报无保留审计意见不覆盖该节或保证指标公式</w:t>
+      </w:r>
+    </w:p>
+    <w:p>
+      <w:r>
+        <w:t>[ks_a_e_bond_repayment_claim] ks_a_s_25 第93—95页，可转债发行、无担保、存续变动；第95页四、6（3）及五至七项。第93—94页发行与挂牌、无担保、面值变动及转股价与既有债项记录一致。第95页管理层称综合授信充足、融资快速有效、内生经营现金稳定、募投实施提升盈利，遇回售、赎回或到期可通过自有资金及融资支付本息；同时将大额亏损主要归因于减值并称对生产经营无重大影响。年末除债券外有息债逾期项列不适用，报告期违反规章制度项列否。这是管理层陈述，尚未以银行、合同和项目现金逐笔验证；无担保不表示没有发行人付款责任。 第五项标题为亏损超过上年末净资产10%，正文列归母净利润‑535,342,762.09元、占2025年末公司净资产13.49%；正文期间与标题不同，且公司净资产未在该行明示归母/总权益。 发行人管理层公开陈述；与资金可达性、授信条件、项目进度及实际偿付分别核对；第100页其他信息说明不对未来偿债安排提供审计鉴证</w:t>
+      </w:r>
+    </w:p>
+    <w:p>
+      <w:r>
+        <w:t>[ks_a_e_external_rating_2025] ks_a_s_25 第95页四、6（2），本年度可转债资信评级。年报引述联合资信2025-06-24跟踪报告（联合〔2025〕5318号）：主体长期信用等级AA、科顺转债AA、展望稳定。这里只记录年报中的历史外部评级事实；不是本研究截止日评级、因素输入、方法校准值或对条件建议的替代。 年报对外部机构历史结论的引述；本条未独立复核该2025评级报告全文</w:t>
+      </w:r>
+    </w:p>
+    <w:p>
+      <w:r>
+        <w:t>[ks_a_e_project_reported_benefits] ks_a_s_25 第83页募集资金承诺投资项目表，四项建设/升级项目及补流行；表格图像核对。安徽滁州、福建三明、重庆长寿扩产及智能化升级四行，本报告期实现效益和累计实现效益均明列0，预定可使用日期均2028-12-31，是否达到预计效益均列否。补充流动资金另列，其是否达到预计效益为不适用；不能由四项项目效益零推断全部募投资金未产生任何融资成本节约或经营帮助，也不能将这些未披露的帮助当已量化偿债来源。 发行人项目表原披露，不是本研究独立审计项目收益；零为表列值，未将空白替零</w:t>
       </w:r>
     </w:p>
     <w:sectPr>

</xml_diff>

<commit_message>
Clarify historical depreciation bridges and source row labels
</commit_message>
<xml_diff>
--- a/examples/keshun-2025/deliverables/report.docx
+++ b/examples/keshun-2025/deliverables/report.docx
@@ -17,17 +17,12 @@
     </w:p>
     <w:p>
       <w:r>
+        <w:t>对象：科顺防水科技股份有限公司。范围：合并主体为主，母公司偿债资源单列；期后季度和历史原口径分别列示；Δ_A、Δ_H和持续经营范围Γ独立保留未知。会计基础：中国企业会计准则。</w:t>
+      </w:r>
+    </w:p>
+    <w:p>
+      <w:r>
         <w:t>截至2026-06-30的境内相对信用研究：历史因素代表值支持主体及科顺转债BBB+、负面展望的条件分支；未来经营、税款和融资链展示条件变化，未选定唯一评级。实际付款、资金用途、同控版本与持续范围桥、发行人资金及承诺仍待核，条件数字不能证明付款覆盖。</w:t>
-      </w:r>
-    </w:p>
-    <w:p>
-      <w:r>
-        <w:t>方法与适用范围：联合一般工商V4.1.202606及总论/支持V4.1.202605、债项V3.0.202207；采用公开规则并明示研究适配，不是机构评级复现或发布。</w:t>
-      </w:r>
-    </w:p>
-    <w:p>
-      <w:r>
-        <w:t>方法与适用范围：四表及附注取证、确定性计算、经营/财务因素与现金条件情景使用同一底稿。</w:t>
       </w:r>
     </w:p>
     <w:p>
@@ -55,7 +50,12 @@
     </w:p>
     <w:p>
       <w:r>
-        <w:t>范围：合并主体为主，母公司偿债资源单列；期后季度和历史原口径分别列示；Δ_A、Δ_H和持续经营范围Γ独立保留未知。会计基础：中国企业会计准则。</w:t>
+        <w:t>方法与适用范围：联合一般工商V4.1.202606及总论/支持V4.1.202605、债项V3.0.202207；采用公开规则并明示研究适配，不是机构评级复现或发布。</w:t>
+      </w:r>
+    </w:p>
+    <w:p>
+      <w:r>
+        <w:t>方法与适用范围：四表及附注取证、确定性计算、经营/财务因素与现金条件情景使用同一底稿。</w:t>
       </w:r>
     </w:p>
     <w:p>
@@ -100,7 +100,7 @@
     </w:p>
     <w:p>
       <w:r>
-        <w:t>来源 ks_r_issue 的正式公布日期未核验；不得据此证明在信息截止日前已公开。当前披露内容可以继续分析，历史时点结论须补充公告时间证据。</w:t>
+        <w:t>来源 ks_a_s_23, ks_r_issue 的正式公布日期未核验；不得据此证明在信息截止日前已公开。当前披露内容可以继续分析，历史时点结论须补充公告时间证据。</w:t>
       </w:r>
     </w:p>
     <w:p>
@@ -1003,12 +1003,12 @@
     </w:p>
     <w:p>
       <w:r>
-        <w:t>横琴的金融资产与融资现金影响权益、利润、现金；丰泽失控后恢复控制和保理出表亦影响跨年可比性。</w:t>
-      </w:r>
-    </w:p>
-    <w:p>
-      <w:r>
-        <w:t>证据：ks_a_e_summary, ks_a_e_old, ks_a_e_invest, ks_a_missing_totaldebt_2023, ks_a_missing_interest_total_2023</w:t>
+        <w:t>横琴的金融资产与融资现金影响权益、利润、现金；丰泽失控后恢复控制和保理出表亦影响跨年可比性。 原2023CF类别桥‑6,326.31 万元人民币未含独立披露的投资性房地产折旧488.02 万元人民币，完整DA桥为‑5,838.29 万元人民币。两者均保留原范围，不补最新同控三年盈利输入；2024/2025的CF折旧行已含该项，不再重复加回。</w:t>
+      </w:r>
+    </w:p>
+    <w:p>
+      <w:r>
+        <w:t>证据：ks_a_e_summary, ks_a_e_old, ks_a_e_invest, ks_a_missing_totaldebt_2023, ks_a_missing_interest_total_2023, ks_a_e_old_ip_dep, ks_a_old_ebitda_complete_da_2023</w:t>
       </w:r>
     </w:p>
     <w:p>
@@ -22033,6 +22033,15 @@
     </w:p>
     <w:p>
       <w:r>
+        <w:t>[ks_a_s_23] 科顺防水科技股份有限公司2023年年度报告；公布 未核验</w:t>
+        <w:br/>
+        <w:t>https://static.cninfo.com.cn/finalpage/2024-04-30/1219911976.PDF</w:t>
+        <w:br/>
+        <w:t>巨潮官方完整原件；路径含2024-04-30，未独立确认首次公开日。仅补核原范围2023折旧组成，不作为时点回测输入，不替代2025同控重述。</w:t>
+      </w:r>
+    </w:p>
+    <w:p>
+      <w:r>
         <w:t>[ks_a_s_q1] 科顺防水科技股份有限公司2026年第一季度报告；公布 2026-04-24</w:t>
         <w:br/>
         <w:t>https://static.cninfo.com.cn/finalpage/2026-04-24/1225172706.PDF</w:t>
@@ -22407,6 +22416,11 @@
         <w:t>https://static.cninfo.com.cn/finalpage/2024-08-28/1221008879.PDF</w:t>
         <w:br/>
         <w:t>使用PDF2—3披露的经销商保证安排、资金用途和反担保要求；只证明公开安排，不证明每笔贷款已按约执行或反担保可回收。</w:t>
+      </w:r>
+    </w:p>
+    <w:p>
+      <w:r>
+        <w:t>[ks_a_e_old_ip_dep] ks_a_s_23 2023年报PDF/印刷172页附注15完整投资性房地产表；199页附注66现金流补充表，单位元。投资性房地产房屋、建筑物本期计提或摊销4880204.91元；累计折旧和摊销从1220051.28至6100256.19。CF所列固定资产折旧232646650.89仅匹配固定资产计提，不含该独立类别，使用权折旧另列。保留原范围类别桥与完整DA桥，不补同控重述2023。 发行人官方完整原件；相应完整表及表头、类别、年度列已核，未执行资产审计。</w:t>
       </w:r>
     </w:p>
     <w:p>

</xml_diff>

<commit_message>
Correct cumulative proceeds timing and preserve financing source precision
</commit_message>
<xml_diff>
--- a/examples/keshun-2025/deliverables/report.docx
+++ b/examples/keshun-2025/deliverables/report.docx
@@ -1074,12 +1074,12 @@
     </w:p>
     <w:p>
       <w:r>
-        <w:t>年末未归还12.75 亿元人民币；公告次年初旧轮已归还13.00 亿元人民币，并批准新一轮上限13.00 亿元人民币。时点疑点已由公告澄清，授权上限不等于六月实际占用。</w:t>
-      </w:r>
-    </w:p>
-    <w:p>
-      <w:r>
-        <w:t>仍需关注一般户混用期间用途追踪、专户整改执行及研究截止日占用；不能以续作代表永久资本，也不能将归还额倒填年末。</w:t>
+        <w:t>年末未归还12.75 亿元人民币；公告确认截至2026-01-06旧轮累计已归还13.00 亿元人民币，并批准新一轮上限13.00 亿元人民币。旧轮截至公告日全数归还已有支持，逐日交易和年末至公告日的余额桥仍未关闭；授权上限不等于六月实际占用。</w:t>
+      </w:r>
+    </w:p>
+    <w:p>
+      <w:r>
+        <w:t>继续核年末余额至累计归还的提款/收支桥、一般户混用期间用途、专户整改及研究截止日占用；不能把旧轮累计额认定为2026年1月净现金流，不能以续作代表永久资本，也不能将归还额倒填年末。</w:t>
       </w:r>
     </w:p>
     <w:p>
@@ -1094,12 +1094,12 @@
     </w:p>
     <w:p>
       <w:r>
-        <w:t>其他解释：公告证实旧轮归还并获新授权，可解释不同报告时点的余额，不构成旧轮长期未归还的证据。；新授权可能未全额使用，也可能部分重新投入经营；上限和实际占用不能互换。</w:t>
-      </w:r>
-    </w:p>
-    <w:p>
-      <w:r>
-        <w:t>判断改变条件：以截止日实际占用和用途流水确认应恢复额度、时间及项目需求，并验证混用问题整改执行；已公开的旧轮归还时点不再重复请求。</w:t>
+        <w:t>其他解释：公告证实旧轮截至披露日全数归还并获新授权，不构成旧轮持续未归还的证据；具体归还日及年末到公告日余额仍需流水衔接。；新授权可能未全额使用，也可能部分重新投入经营；上限和实际占用不能互换。</w:t>
+      </w:r>
+    </w:p>
+    <w:p>
+      <w:r>
+        <w:t>判断改变条件：已完成的旧轮累计归还不再重复请求；补逐日流水和年末至公告日收支桥，以截止日实际占用、用途和项目需要确认恢复额度及时间，并验证混用问题整改。</w:t>
       </w:r>
     </w:p>
     <w:p>
@@ -3844,12 +3844,12 @@
     </w:p>
     <w:p>
       <w:r>
-        <w:t>按同一法人、银行及产品对应总额、已用、未用、共享或循环额度，核抵质押、保证金、财务约束、提款前提、撤销权和有效期，再将真正可用金额匹配付款日。综合授信可能包含票据、保函或其他产品，年报借款额度也可能有不同总体；这些是候选解释，不是已查明原因。现有再融资研究分5.0/4.5及加权4.65仅保留为原条件分支，金额冲突未关闭前不能证明这一赋值或BBB+资金前提充分，也不因缺资料任意另给分。 年报第95页管理层称授信充足、可快速融资且自有资金及融资足以偿付；这与已披露季度融资形成支持线索，但未解决两个额度总体及合同可提用条件的差异。</w:t>
-      </w:r>
-    </w:p>
-    <w:p>
-      <w:r>
-        <w:t>证据：ks_a_e_maturity, ks_credit_e_facilities, ks_credit_facility_gap</w:t>
+        <w:t>按同一法人、银行及产品对应总额、已用、未用、共享或循环额度，核抵质押、保证金、财务约束、提款前提、撤销权和有效期，再将真正可用金额匹配付款日。综合授信可能包含票据、保函或其他产品，年报借款额度也可能有不同总体；这些是候选解释，不是已查明原因。现有再融资研究分5.0/4.5及加权4.65仅保留为原条件分支，金额冲突未关闭前不能证明这一赋值或BBB+资金前提充分，也不因缺资料任意另给分。 年报第95页管理层称授信充足、可快速融资且自有资金及融资足以偿付；这与已披露季度融资形成支持线索，但未解决两个额度总体及合同可提用条件的差异。 2026-022公告另披露发行人拟申请敞口上限100.00 亿元人民币及多种现金/非现金产品，最终仍由银行核准；它补充渠道与主体线索，不关闭2025年两总体桥，不增加已落实资金。</w:t>
+      </w:r>
+    </w:p>
+    <w:p>
+      <w:r>
+        <w:t>证据：ks_a_e_maturity, ks_credit_e_facilities, ks_credit_facility_gap, ks_credit_e_facility_application26</w:t>
       </w:r>
     </w:p>
     <w:p>
@@ -6524,7 +6524,7 @@
     </w:p>
     <w:p>
       <w:r>
-        <w:t>未来合计 26.22 亿元人民币，其中到期本金 21.98 亿元人民币、内含末息 4,395.64 万元人民币、其他到期溢价 2.86 亿元人民币。每年按合同付息日及顺延规则确定，付息日后五个交易日内支付，到期在2029-08-03之后五个交易日内兑付。此为已取证本金起点的条件情景，不是六月末实际余额或未来转股预测。</w:t>
+        <w:t>未来合计 26.22 亿元人民币，其中到期本金 21.98 亿元人民币、内含末息 4,395.64 万元人民币、其他到期溢价 2.86 亿元人民币。每年按合同付息日及顺延规则确定，付息日后五个交易日内支付，到期在2029-08-03之后五个交易日内兑付。此为已取证本金起点的条件情景，不是六月末实际余额或未来转股预测。 截止日前已公开的机构6月9日余额另列为21.9599亿元（原文四位小数）；它是后续转股的公开线索，不是精确登记面额。此节点未代入原固定本金计算，六月末面额仍缺失。</w:t>
       </w:r>
     </w:p>
     <w:p>
@@ -6534,7 +6534,7 @@
     </w:p>
     <w:p>
       <w:r>
-        <w:t>反证：ks_d_f_face_conversion_q1, ks_d_e_put, ks_d_e_maturity_call</w:t>
+        <w:t>反证：ks_d_f_face_conversion_q1, ks_d_e_put, ks_d_e_maturity_call, ks_d_f_face_june9_agency</w:t>
       </w:r>
     </w:p>
     <w:p>
@@ -10070,6 +10070,11 @@
     </w:p>
     <w:p>
       <w:r>
+        <w:t>旧轮13亿元为截至公告日完成的累计用途恢复，不是2026年六天现金流。输入快照的期间及性质已按公告订正，金额和原因素结果不变；导出不表示再融资评价重新执行。</w:t>
+      </w:r>
+    </w:p>
+    <w:p>
+      <w:r>
         <w:t>完整结果、输入快照与复算信息见 Excel Q6/Quant6 系列工作表及 quantitative-ks_r_finance.json。</w:t>
       </w:r>
     </w:p>
@@ -21763,12 +21768,12 @@
     </w:p>
     <w:p>
       <w:r>
-        <w:t>取得混用期间逐笔银行流水与用途追踪、专户整改执行、截至研究截止日新轮实际占用及募投资金需求。旧轮归还和新轮授权公告已取得，不再请求重复证明授权时点。</w:t>
-      </w:r>
-    </w:p>
-    <w:p>
-      <w:r>
-        <w:t>影响：年末余额与期后归还续作能否衔接？ 所需资料用于检验该判断的金额、期限或执行依据。。责任角色：发行人财务/法务及独立核查方。关闭条件：以截止日实际占用和用途流水确认应恢复额度、时间及项目需求，并验证混用问题整改执行；已公开的旧轮归还时点不再重复请求。</w:t>
+        <w:t>取得混用期间逐笔银行流水与用途追踪、年末至归还公告日的提款/归还余额桥、专户整改执行、截至研究截止日新轮实际占用及募投资金需求。旧轮截至公告日累计归还完成状态和新轮授权公告已取得，不再重复请求该完成状态或授权时点。</w:t>
+      </w:r>
+    </w:p>
+    <w:p>
+      <w:r>
+        <w:t>影响：年末余额与期后归还续作能否衔接？ 所需资料用于检验该判断的金额、期限或执行依据。。责任角色：发行人财务/法务及独立核查方。关闭条件：以逐笔流水和年末至公告日余额桥核对归还交易，以截止日实际占用和用途流水确认应恢复额度、时间及项目需求，并验证混用整改；已公开的旧轮截至公告日累计归还完成状态不再重复请求，不能据此免除逐日交易核对。</w:t>
       </w:r>
     </w:p>
     <w:p>
@@ -21894,7 +21899,7 @@
     </w:p>
     <w:p>
       <w:r>
-        <w:t>影响：现有最新已取得实际面值是 21.98 亿元人民币，其原始时点为一季度末，不能改写为六月末。。责任角色：发行人债券事务及登记结算资料管理责任人。关闭条件：原始日期、可得日期和面值变动可核验，并在保留旧节点的基础上重跑现金流情景。</w:t>
+        <w:t>影响：现有精确发行人面值为21.98 亿元人民币，时点是三月末；机构另公开6月9日21.9599亿元显示值，但未给精确张数、元面额及舍入规则，且不是六月末。需要截止日内可得的同日精准余额，不能将较晚显示值或原情景改写为六月末实际面值。。责任角色：发行人债券事务及登记结算资料管理责任人。关闭条件：原始日期、可得日期和面值变动可核验，并在保留旧节点的基础上重跑现金流情景。</w:t>
       </w:r>
     </w:p>
     <w:p>
@@ -22361,7 +22366,7 @@
         <w:br/>
         <w:t>https://www.lhratings.com/reports/B010330-P61284-2021-GZ2026.pdf</w:t>
         <w:br/>
-        <w:t>使用PDF6、8的方法适用性、17（印刷14）的授信及经销商融资事实陈述、23的通用等级/展望定义。外部机构评级、因素得分、预测及评价结论未用作本案输入或校准目标；读取其公开陈述不等于重复执行其银行征信或合同核查。</w:t>
+        <w:t>使用PDF6、8的方法适用性、17（印刷14）的授信及经销商融资事实陈述、18（印刷15）的按原文精度披露债券余额、23的通用等级/展望定义。外部机构评级、因素得分、预测及评价结论未用作本案输入或校准目标；读取其公开陈述不等于重复执行其银行征信或合同核查。</w:t>
       </w:r>
     </w:p>
     <w:p>
@@ -22420,6 +22425,15 @@
     </w:p>
     <w:p>
       <w:r>
+        <w:t>[ks_credit_s_facility_application26] 科顺股份关于拟向银行申请授信额度的公告（2026-022）；公布 2026-04-24</w:t>
+        <w:br/>
+        <w:t>https://static.cninfo.com.cn/finalpage/2026-04-24/1225172729.PDF</w:t>
+        <w:br/>
+        <w:t>完整1页公告；拟申请额度、产品及有效期分列，最终以各银行实际核准为准；不作为2025授信总体桥或付款日可用资金。</w:t>
+      </w:r>
+    </w:p>
+    <w:p>
+      <w:r>
         <w:t>[ks_a_e_old_ip_dep] ks_a_s_23 2023年报PDF/印刷172页附注15完整投资性房地产表；199页附注66现金流补充表，单位元。投资性房地产房屋、建筑物本期计提或摊销4880204.91元；累计折旧和摊销从1220051.28至6100256.19。CF所列固定资产折旧232646650.89仅匹配固定资产计提，不含该独立类别，使用权折旧另列。保留原范围类别桥与完整DA桥，不补同控重述2023。 发行人官方完整原件；相应完整表及表头、类别、年度列已核，未执行资产审计。</w:t>
       </w:r>
     </w:p>
@@ -22605,7 +22619,7 @@
     </w:p>
     <w:p>
       <w:r>
-        <w:t>[ks_a_e_return26] ks_a_s_return26 归还公告PDF第1—2页，公告2026-002。截至2026-01-06旧轮临时补流13亿元全部归还，未超过12个月；公告归还额不是2025年末未归还余额，不倒填年末。 发行人正式披露；财务报表经审计，但本分析未复做审计程序</w:t>
+        <w:t>[ks_a_e_return26] ks_a_s_return26 归还公告PDF第1—2页，公告2026-002。截至2026-01-06旧轮临时补流13亿元全部归还，使用期限未超过12个月。公告仅证明旧轮累计归还完成，未给逐笔交易日、年末至公告日的提款/归还桥或2026年1月净归还流量；不得倒填2025年末未归还余额。 发行人正式披露；财务报表经审计，但本分析未复做审计程序</w:t>
       </w:r>
     </w:p>
     <w:p>
@@ -23376,6 +23390,16 @@
     <w:p>
       <w:r>
         <w:t>[ks_a_e_project_reported_benefits] ks_a_s_25 第83页募集资金承诺投资项目表，四项建设/升级项目及补流行；表格图像核对。安徽滁州、福建三明、重庆长寿扩产及智能化升级四行，本报告期实现效益和累计实现效益均明列0，预定可使用日期均2028-12-31，是否达到预计效益均列否。补充流动资金另列，其是否达到预计效益为不适用；不能由四项项目效益零推断全部募投资金未产生任何融资成本节约或经营帮助，也不能将这些未披露的帮助当已量化偿债来源。 发行人项目表原披露，不是本研究独立审计项目收益；零为表列值，未将空白替零</w:t>
+      </w:r>
+    </w:p>
+    <w:p>
+      <w:r>
+        <w:t>[ks_d_e_face_june9_agency] ks_r_application 跟踪评级报告PDF18/印刷15，债券偿还能力分析的6月9日余额段；原文单位亿元、小数点后4位。2026-06-23公开报告称截至2026-06-09科顺转债余额为21.9599亿元。原文未给该日精确张数、人民币元面额或舍入规则；较晚节点另列，不替代三月末精准发行人记录或六月末未知值。 评级机构公开事实陈述，非本分析独立登记结算核验；保留显示精度及未说明的舍入规则。</w:t>
+      </w:r>
+    </w:p>
+    <w:p>
+      <w:r>
+        <w:t>[ks_credit_e_facility_application26] ks_credit_s_facility_application26 公告2026-022，PDF1全文；拟申请敞口、业务品种及12个月申请有效期。上市发行人拟申请合计不超过100亿元敞口授信，以各银行实际核准为准；涉及流贷、银票/贴现/票据池、国内信用证融资、进出口押汇、保函及保理等，申请期从披露日起12个月。不是已批准、已承诺可提或新增现金，不证明2025年两个额度的总体关系。 发行人正式申请公告；未取得银行合同、核准及提款条件满足证据。</w:t>
       </w:r>
     </w:p>
     <w:sectPr>

</xml_diff>